<commit_message>
Unify weekly-releaser definition on Section 5.2 criterion; mark 5.6 subgroup estimates for re-estimation
Co-Authored-By: Claude Sonnet 5.5 <noreply@anthropic.com>
Claude-Session: https://claude.ai/code/session_017rpe9Z3CoCCyiANf2szbvW
</commit_message>
<xml_diff>
--- a/isr-revision/manuscript/Manuscript_ISR_Format_tracked.docx
+++ b/isr-revision/manuscript/Manuscript_ISR_Format_tracked.docx
@@ -5519,94 +5519,94 @@
         <w:t xml:space="preserve">Heterogeneity.</w:t>
       </w:r>
       <w:r>
-        <w:t xml:space="preserve"> We repeat the RQ1 and RQ3 analyses (i) excluding the two repositories that may rely on automated release pipelines (anthropic-sdk-python and openai-python), (ii) separately for the weekly releasers (a median gap of at most one week between release weeks) and for the others, and (iii) by repository category where at least three repositories share a category.</w:t>
-      </w:r>
-    </w:p>
-    <w:p>
-      <w:pPr>
-        <w:pStyle w:val="Heading2"/>
-      </w:pPr>
-      <w:r>
-        <w:t xml:space="preserve">5. Results</w:t>
-      </w:r>
-    </w:p>
-    <w:p>
-      <w:pPr>
-        <w:pStyle w:val="Heading3"/>
-      </w:pPr>
-      <w:r>
-        <w:t xml:space="preserve">5.1. RQ1: Bug Reports Show No Measurable Rise with the Age of a Release</w:t>
-      </w:r>
-    </w:p>
-    <w:p>
-      <w:pPr>
-        <w:pStyle w:val="FirstParagraph"/>
-      </w:pPr>
-      <w:r>
-        <w:t xml:space="preserve">Under specification (b), pooling the 19 repository-level slopes with a random-effects model gives a log-rate slope of bug reports on weeks since release of −0.0029 per week (95% CI −0.015 to 0.010; τ² = 0.0003). Eight of the 19 repository-level slopes are positive. One (Ollama) is significantly positive and two (semantic-kernel and text-generation-inference) are significantly negative, three significant slopes in both directions among 19, somewhat more than the one expected by chance. The interval rules out an increase in the bug rate of more than about 1 percent per week. Because bug reports enter the offset, this estimate is biased toward zero if errors rise, but in our synthetic checks (Section 4.3) the bias was not large enough to hide a planted rise. It is one of the two primary tests of H1.</w:t>
-      </w:r>
-    </w:p>
-    <w:p>
-      <w:pPr>
-        <w:pStyle w:val="BodyText"/>
-      </w:pPr>
-      <w:r>
-        <w:t xml:space="preserve">Under specification (a), raw bug counts do fall with age: the pooled slope is −0.026 (95% CI −0.050 to −0.002). Once we account for the total number of issues filed, as in (b), the decline disappears. The early surge appears to be a general burst of issue-filing right after a release, driven by attention, announcements, and defects together, and not a change in the share of reports that concern bugs. In the terms of Section 3, specification (a) is therefore uninformative about the error state because of this burst.</w:t>
-      </w:r>
-    </w:p>
-    <w:p>
-      <w:pPr>
-        <w:pStyle w:val="BodyText"/>
-      </w:pPr>
-      <w:r>
-        <w:t xml:space="preserve">Specification (c), which controls for the log of weekly non-bug issues, gives −0.019 (95% CI −0.040 to 0.002), and specification (d), which adds indicators for the first three weeks after a release, gives +0.017 (95% CI −0.003 to 0.038). Under (d), 11 of the 19 repository-level slopes are positive and two are significantly positive. The slope is not identified for the two weekly releasers with almost no observations beyond the third week (anthropic-sdk-python and autogen, with standard errors above 4), and the random-effects estimate gives them negligible weight. H1 is therefore not supported at conventional levels, but the upper limit of the (d) interval means that an accumulation of up to about 3.9 percent per week in the bug rate cannot be ruled out once the burst of attention is absorbed. The evidence against an accumulating error state is thus weaker than the estimate under (b) alone suggests.</w:t>
-      </w:r>
-    </w:p>
-    <w:p>
-      <w:pPr>
-        <w:pStyle w:val="Heading3"/>
-      </w:pPr>
-      <w:r>
-        <w:t xml:space="preserve">5.2. RQ2: The Release Hazard Does Not Rise with Age</w:t>
-      </w:r>
-    </w:p>
-    <w:p>
-      <w:pPr>
-        <w:pStyle w:val="FirstParagraph"/>
-      </w:pPr>
-      <w:r>
-        <w:t xml:space="preserve">The pooled release-hazard logit slope is −0.090 per week of age (95% CI −0.211 to 0.030; </w:t>
-      </w:r>
-      <w:r>
-        <w:rPr>
-          <w:i/>
-          <w:iCs/>
-        </w:rPr>
-        <w:t xml:space="preserve">τ²</w:t>
-      </w:r>
-      <w:r>
-        <w:t xml:space="preserve"> = 0.049), which is not distinguishable from zero. Eight of the 19 repository-level slopes are positive. One, for vLLM, is significantly positive at the 5 percent level (a ratio of slope to standard error of about 2.4), which is about what chance alone would produce among 19 tests and does not survive a correction for multiple testing; the next largest ratio, for lm-evaluation-harness, is about 1.8 (Table 1). H2a is not supported in 18 of the 19 repositories.</w:t>
-      </w:r>
-    </w:p>
-    <w:p>
-      <w:pPr>
-        <w:pStyle w:val="BodyText"/>
-      </w:pPr>
-      <w:r>
-        <w:t xml:space="preserve">Six repositories have a significantly negative slope, and four of them (anthropic-sdk-python, semantic-kernel, openai-python, and llama_index) are among the seven repositories with a median release cycle of one week, which also publish hot-fixes soon after a release. </w:t>
+        <w:t xml:space="preserve"> We repeat the RQ1 and RQ3 analyses (i) excluding the two repositories that may rely on automated release pipelines (anthropic-sdk-python and openai-python), (ii) separately for </w:t>
       </w:r>
       <w:del w:id="9104" w:author="Claude" w:date="2026-10-13T00:00:00Z">
         <w:r>
-          <w:delText xml:space="preserve">Excluding the seven weekly releasers gives</w:delText>
+          <w:delText xml:space="preserve">the weekly releasers (a median gap of at most one week between release weeks)</w:delText>
         </w:r>
       </w:del>
       <w:ins w:id="9105" w:author="Claude" w:date="2026-10-13T00:00:00Z">
         <w:r>
-          <w:t xml:space="preserve">Excluding the seven repositories with a median release cycle of one week (Table 1) gives</w:t>
+          <w:t xml:space="preserve">the weekly releasers (the seven repositories with a median release cycle of one week in Table 1)</w:t>
         </w:r>
       </w:ins>
       <w:r>
-        <w:t xml:space="preserve"> a pooled slope of 0.040 (95% CI −0.081 to 0.162), which is close to zero and consistent with H2b. Repository-level slopes that condition on surviving the first week after a release are unstable, because several repositories have too few releases at later ages, and we report the pooled estimate for that restriction below. In the language of the price literature, hot-fixes resemble temporary sales. They are frequent, short-lived adjustments that dominate the raw hazard and obscure a regular cadence underneath (Nakamura and Steinsson 2008).</w:t>
+        <w:t xml:space="preserve"> and for the others, and (iii) by repository category where at least three repositories share a category.</w:t>
+      </w:r>
+    </w:p>
+    <w:p>
+      <w:pPr>
+        <w:pStyle w:val="Heading2"/>
+      </w:pPr>
+      <w:r>
+        <w:t xml:space="preserve">5. Results</w:t>
+      </w:r>
+    </w:p>
+    <w:p>
+      <w:pPr>
+        <w:pStyle w:val="Heading3"/>
+      </w:pPr>
+      <w:r>
+        <w:t xml:space="preserve">5.1. RQ1: Bug Reports Show No Measurable Rise with the Age of a Release</w:t>
+      </w:r>
+    </w:p>
+    <w:p>
+      <w:pPr>
+        <w:pStyle w:val="FirstParagraph"/>
+      </w:pPr>
+      <w:r>
+        <w:t xml:space="preserve">Under specification (b), pooling the 19 repository-level slopes with a random-effects model gives a log-rate slope of bug reports on weeks since release of −0.0029 per week (95% CI −0.015 to 0.010; τ² = 0.0003). Eight of the 19 repository-level slopes are positive. One (Ollama) is significantly positive and two (semantic-kernel and text-generation-inference) are significantly negative, three significant slopes in both directions among 19, somewhat more than the one expected by chance. The interval rules out an increase in the bug rate of more than about 1 percent per week. Because bug reports enter the offset, this estimate is biased toward zero if errors rise, but in our synthetic checks (Section 4.3) the bias was not large enough to hide a planted rise. It is one of the two primary tests of H1.</w:t>
+      </w:r>
+    </w:p>
+    <w:p>
+      <w:pPr>
+        <w:pStyle w:val="BodyText"/>
+      </w:pPr>
+      <w:r>
+        <w:t xml:space="preserve">Under specification (a), raw bug counts do fall with age: the pooled slope is −0.026 (95% CI −0.050 to −0.002). Once we account for the total number of issues filed, as in (b), the decline disappears. The early surge appears to be a general burst of issue-filing right after a release, driven by attention, announcements, and defects together, and not a change in the share of reports that concern bugs. In the terms of Section 3, specification (a) is therefore uninformative about the error state because of this burst.</w:t>
+      </w:r>
+    </w:p>
+    <w:p>
+      <w:pPr>
+        <w:pStyle w:val="BodyText"/>
+      </w:pPr>
+      <w:r>
+        <w:t xml:space="preserve">Specification (c), which controls for the log of weekly non-bug issues, gives −0.019 (95% CI −0.040 to 0.002), and specification (d), which adds indicators for the first three weeks after a release, gives +0.017 (95% CI −0.003 to 0.038). Under (d), 11 of the 19 repository-level slopes are positive and two are significantly positive. The slope is not identified for the two weekly releasers with almost no observations beyond the third week (anthropic-sdk-python and autogen, with standard errors above 4), and the random-effects estimate gives them negligible weight. H1 is therefore not supported at conventional levels, but the upper limit of the (d) interval means that an accumulation of up to about 3.9 percent per week in the bug rate cannot be ruled out once the burst of attention is absorbed. The evidence against an accumulating error state is thus weaker than the estimate under (b) alone suggests.</w:t>
+      </w:r>
+    </w:p>
+    <w:p>
+      <w:pPr>
+        <w:pStyle w:val="Heading3"/>
+      </w:pPr>
+      <w:r>
+        <w:t xml:space="preserve">5.2. RQ2: The Release Hazard Does Not Rise with Age</w:t>
+      </w:r>
+    </w:p>
+    <w:p>
+      <w:pPr>
+        <w:pStyle w:val="FirstParagraph"/>
+      </w:pPr>
+      <w:r>
+        <w:t xml:space="preserve">The pooled release-hazard logit slope is −0.090 per week of age (95% CI −0.211 to 0.030; </w:t>
+      </w:r>
+      <w:r>
+        <w:rPr>
+          <w:i/>
+          <w:iCs/>
+        </w:rPr>
+        <w:t xml:space="preserve">τ²</w:t>
+      </w:r>
+      <w:r>
+        <w:t xml:space="preserve"> = 0.049), which is not distinguishable from zero. Eight of the 19 repository-level slopes are positive. One, for vLLM, is significantly positive at the 5 percent level (a ratio of slope to standard error of about 2.4), which is about what chance alone would produce among 19 tests and does not survive a correction for multiple testing; the next largest ratio, for lm-evaluation-harness, is about 1.8 (Table 1). H2a is not supported in 18 of the 19 repositories.</w:t>
+      </w:r>
+    </w:p>
+    <w:p>
+      <w:pPr>
+        <w:pStyle w:val="BodyText"/>
+      </w:pPr>
+      <w:r>
+        <w:t xml:space="preserve">Six repositories have a significantly negative slope, and four of them (anthropic-sdk-python, semantic-kernel, openai-python, and llama_index) are among the seven repositories with a median release cycle of one week, which also publish hot-fixes soon after a release. Excluding the seven weekly releasers gives a pooled slope of 0.040 (95% CI −0.081 to 0.162), which is close to zero and consistent with H2b. Repository-level slopes that condition on surviving the first week after a release are unstable, because several repositories have too few releases at later ages, and we report the pooled estimate for that restriction below. In the language of the price literature, hot-fixes resemble temporary sales. They are frequent, short-lived adjustments that dominate the raw hazard and obscure a regular cadence underneath (Nakamura and Steinsson 2008).</w:t>
       </w:r>
     </w:p>
     <w:p>
@@ -5865,20 +5865,20 @@
         <w:t xml:space="preserve">Heterogeneity. </w:t>
       </w:r>
       <w:r>
-        <w:t xml:space="preserve">Excluding the two repositories that may rely on automated release pipelines (anthropic-sdk-python and openai-python) leaves the conclusions unchanged. The pooled age slope is −0.003 under specification (b) (95% CI −0.015 to 0.010) and +0.019 under (d) (−0.007 to 0.044), and the coefficient on bug reports with non-bug issues held fixed rises to 0.304 (SE 0.093). The thirteen slower releasers give 0.000 under (b) (−0.009 to 0.009), +0.015 under (d) (−0.006 to 0.034), and 0.211 (SE 0.082) for the response to bug reports. </w:t>
+        <w:t xml:space="preserve">Excluding the two repositories that may rely on automated release pipelines (anthropic-sdk-python and openai-python) leaves the conclusions unchanged. The pooled age slope is −0.003 under specification (b) (95% CI −0.015 to 0.010) and +0.019 under (d) (−0.007 to 0.044), and the coefficient on bug reports with non-bug issues held fixed rises to 0.304 (SE 0.093). </w:t>
       </w:r>
       <w:del w:id="9106" w:author="Claude" w:date="2026-10-13T00:00:00Z">
         <w:r>
-          <w:delText xml:space="preserve">For the six weekly releasers (a median gap of at most one week between release weeks among all collected releases; Table 1 lists seven repositories with a median cycle of one week)</w:delText>
+          <w:delText xml:space="preserve">The thirteen slower releasers give 0.000 under (b) (−0.009 to 0.009), +0.015 under (d) (−0.006 to 0.034), and 0.211 (SE 0.082) for the response to bug reports. For the six weekly releasers (a median gap of at most one week between release weeks among all collected releases; Table 1 lists seven repositories with a median cycle of one week) the (b) estimate is imprecise (−0.033; −0.104 to 0.038), and the (d) estimate (0.248; 0.077 to 0.418) rests on few observations beyond the third week after a release and is not reliable.</w:delText>
         </w:r>
       </w:del>
       <w:ins w:id="9107" w:author="Claude" w:date="2026-10-13T00:00:00Z">
         <w:r>
-          <w:t xml:space="preserve">For the six weekly releasers, defined as in Section 4.3 by a median gap of at most one week between release weeks among all collected releases (a different criterion from the median release cycle of one week in Table 1, which selects seven repositories and is used in Section 5.2)</w:t>
+          <w:t xml:space="preserve">The twelve other repositories give [ ] under (b), [ ] under (d), and [ ] for the response to bug reports. For the seven weekly releasers (Table 1), the (b) estimate is [ ] and the (d) estimate is [ ]; the latter rests on few observations beyond the third week after a release and should be read with caution.</w:t>
         </w:r>
       </w:ins>
       <w:r>
-        <w:t xml:space="preserve"> the (b) estimate is imprecise (−0.033; −0.104 to 0.038), and the (d) estimate (0.248; 0.077 to 0.418) rests on few observations beyond the third week after a release and is not reliable. Within categories of three repositories the estimates are too imprecise to interpret; agent frameworks show a response to bug reports of 0.709 (SE 0.134) and inference engines an age slope under (d) of 0.045 (0.002 to 0.087), which we treat as exploratory.</w:t>
+        <w:t xml:space="preserve"> Within categories of three repositories the estimates are too imprecise to interpret; agent frameworks show a response to bug reports of 0.709 (SE 0.134) and inference engines an age slope under (d) of 0.045 (0.002 to 0.087), which we treat as exploratory.</w:t>
       </w:r>
     </w:p>
     <w:p>

</xml_diff>

<commit_message>
Insert Figures 1-3 with captions and in-text references (tracked)
Co-Authored-By: Claude Sonnet 5.5 <noreply@anthropic.com>
Claude-Session: https://claude.ai/code/session_017rpe9Z3CoCCyiANf2szbvW
</commit_message>
<xml_diff>
--- a/isr-revision/manuscript/Manuscript_ISR_Format_tracked.docx
+++ b/isr-revision/manuscript/Manuscript_ISR_Format_tracked.docx
@@ -5558,10 +5558,82 @@
       <w:r>
         <w:t xml:space="preserve">Under specification (b), pooling the 19 repository-level slopes with a random-effects model gives a log-rate slope of bug reports on weeks since release of −0.0029 per week (95% CI −0.015 to 0.010; τ² = 0.0003). Eight of the 19 repository-level slopes are positive. One (Ollama) is significantly positive and two (semantic-kernel and text-generation-inference) are significantly negative, three significant slopes in both directions among 19, somewhat more than the one expected by chance. The interval rules out an increase in the bug rate of more than about 1 percent per week. Because bug reports enter the offset, this estimate is biased toward zero if errors rise, but in our synthetic checks (Section 4.3) the bias was not large enough to hide a planted rise. It is one of the two primary tests of H1.</w:t>
       </w:r>
-    </w:p>
-    <w:p>
-      <w:pPr>
+      <w:ins w:id="9114" w:author="Claude" w:date="2026-10-13T00:00:00Z">
+        <w:r>
+          <w:t xml:space="preserve"> Figure 1a shows the repository-level slopes.</w:t>
+        </w:r>
+      </w:ins>
+    </w:p>
+    <w:p>
+      <w:pPr>
+        <w:keepNext/>
         <w:pStyle w:val="BodyText"/>
+        <w:spacing w:before="120" w:after="60" w:line="240" w:lineRule="auto"/>
+        <w:ind w:firstLine="0"/>
+        <w:jc w:val="center"/>
+        <w:rPr>
+          <w:ins w:id="9115" w:author="Claude" w:date="2026-10-13T00:00:00Z"/>
+        </w:rPr>
+      </w:pPr>
+      <w:ins w:id="9116" w:author="Claude" w:date="2026-10-13T00:00:00Z">
+        <w:r>
+          <w:drawing>
+            <wp:inline xmlns:wp="http://schemas.openxmlformats.org/drawingml/2006/wordprocessingDrawing" distT="0" distB="0" distL="0" distR="0">
+              <wp:extent cx="5486400" cy="4114800"/>
+              <wp:docPr id="9001" name="Figure 1" descr="Figure 1"/>
+              <a:graphic xmlns:a="http://schemas.openxmlformats.org/drawingml/2006/main">
+                <a:graphicData uri="http://schemas.openxmlformats.org/drawingml/2006/picture">
+                  <pic:pic xmlns:pic="http://schemas.openxmlformats.org/drawingml/2006/picture">
+                    <pic:nvPicPr>
+                      <pic:cNvPr id="9001" name="fig1_repository_slopes.png"/>
+                      <pic:cNvPicPr/>
+                    </pic:nvPicPr>
+                    <pic:blipFill>
+                      <a:blip xmlns:r="http://schemas.openxmlformats.org/officeDocument/2006/relationships" r:embed="rId9001"/>
+                      <a:stretch>
+                        <a:fillRect/>
+                      </a:stretch>
+                    </pic:blipFill>
+                    <pic:spPr>
+                      <a:xfrm>
+                        <a:off x="0" y="0"/>
+                        <a:ext cx="5486400" cy="4114800"/>
+                      </a:xfrm>
+                      <a:prstGeom prst="rect">
+                        <a:avLst/>
+                      </a:prstGeom>
+                    </pic:spPr>
+                  </pic:pic>
+                </a:graphicData>
+              </a:graphic>
+            </wp:inline>
+          </w:drawing>
+        </w:r>
+      </w:ins>
+    </w:p>
+    <w:p>
+      <w:pPr>
+        <w:pStyle w:val="BodyText"/>
+        <w:rPr>
+          <w:ins w:id="9117" w:author="Claude" w:date="2026-10-13T00:00:00Z"/>
+        </w:rPr>
+      </w:pPr>
+      <w:ins w:id="9118" w:author="Claude" w:date="2026-10-13T00:00:00Z">
+        <w:r>
+          <w:rPr>
+            <w:b/>
+            <w:bCs/>
+          </w:rPr>
+          <w:t xml:space="preserve">Figure 1.</w:t>
+        </w:r>
+        <w:r>
+          <w:t xml:space="preserve"> Repository-level age slopes. (a) Log-rate slope of weekly bug reports on weeks since the last release, specification (b). (b) Logit slope of the release hazard on weeks since the last release. Points are estimates with 95% intervals from the cycle bootstrap; grey points are repositories with a median release cycle of one week; diamonds are random-effects pooled estimates. Rows are ordered by the release-hazard slope.</w:t>
+        </w:r>
+      </w:ins>
+    </w:p>
+    <w:p>
+      <w:pPr>
+        <w:pStyle w:val="BodyText"/>
       </w:pPr>
       <w:r>
         <w:t xml:space="preserve">Under specification (a), raw bug counts do fall with age: the pooled slope is −0.026 (95% CI −0.050 to −0.002). Once we account for the total number of issues filed, as in (b), the decline disappears. The early surge appears to be a general burst of issue-filing right after a release, driven by attention, announcements, and defects together, and not a change in the share of reports that concern bugs. In the terms of Section 3, specification (a) is therefore uninformative about the error state because of this burst.</w:t>
@@ -5572,8 +5644,83 @@
         <w:pStyle w:val="BodyText"/>
       </w:pPr>
       <w:r>
-        <w:t xml:space="preserve">Specification (c), which controls for the log of weekly non-bug issues, gives −0.019 (95% CI −0.040 to 0.002), and specification (d), which adds indicators for the first three weeks after a release, gives +0.017 (95% CI −0.003 to 0.038). Under (d), 11 of the 19 repository-level slopes are positive and two are significantly positive. The slope is not identified for the two weekly releasers with almost no observations beyond the third week (anthropic-sdk-python and autogen, with standard errors above 4), and the random-effects estimate gives them negligible weight. H1 is therefore not supported at conventional levels, but the upper limit of the (d) interval means that an accumulation of up to about 3.9 percent per week in the bug rate cannot be ruled out once the burst of attention is absorbed. The evidence against an accumulating error state is thus weaker than the estimate under (b) alone suggests.</w:t>
-      </w:r>
+        <w:t xml:space="preserve">Specification (c), which controls for the log of weekly non-bug issues, gives −0.019 (95% CI −0.040 to 0.002), and specification (d), which adds indicators for the first three weeks after a release, gives +0.017 (95% CI −0.003 to 0.038). Under (d), 11 of the 19 repository-level slopes are positive and two are significantly positive. The slope is not identified for the two weekly releasers with almost no observations beyond the third week (anthropic-sdk-python and autogen, with standard errors above 4), and the random-effects estimate gives them negligible weight. H1 is therefore not supported at conventional levels, but the upper limit of the (d) interval means that an accumulation of up to about 3.9 percent per week in the bug rate cannot be ruled out once the burst of attention is absorbed.</w:t>
+      </w:r>
+      <w:ins w:id="9119" w:author="Claude" w:date="2026-10-13T00:00:00Z">
+        <w:r>
+          <w:t xml:space="preserve"> Figure 2 compares the four specifications.</w:t>
+        </w:r>
+      </w:ins>
+      <w:r>
+        <w:t xml:space="preserve"> The evidence against an accumulating error state is thus weaker than the estimate under (b) alone suggests.</w:t>
+      </w:r>
+    </w:p>
+    <w:p>
+      <w:pPr>
+        <w:keepNext/>
+        <w:pStyle w:val="BodyText"/>
+        <w:spacing w:before="120" w:after="60" w:line="240" w:lineRule="auto"/>
+        <w:ind w:firstLine="0"/>
+        <w:jc w:val="center"/>
+        <w:rPr>
+          <w:ins w:id="9120" w:author="Claude" w:date="2026-10-13T00:00:00Z"/>
+        </w:rPr>
+      </w:pPr>
+      <w:ins w:id="9121" w:author="Claude" w:date="2026-10-13T00:00:00Z">
+        <w:r>
+          <w:drawing>
+            <wp:inline xmlns:wp="http://schemas.openxmlformats.org/drawingml/2006/wordprocessingDrawing" distT="0" distB="0" distL="0" distR="0">
+              <wp:extent cx="5486400" cy="2286000"/>
+              <wp:docPr id="9002" name="Figure 2" descr="Figure 2"/>
+              <a:graphic xmlns:a="http://schemas.openxmlformats.org/drawingml/2006/main">
+                <a:graphicData uri="http://schemas.openxmlformats.org/drawingml/2006/picture">
+                  <pic:pic xmlns:pic="http://schemas.openxmlformats.org/drawingml/2006/picture">
+                    <pic:nvPicPr>
+                      <pic:cNvPr id="9002" name="fig2_rq1_specifications.png"/>
+                      <pic:cNvPicPr/>
+                    </pic:nvPicPr>
+                    <pic:blipFill>
+                      <a:blip xmlns:r="http://schemas.openxmlformats.org/officeDocument/2006/relationships" r:embed="rId9002"/>
+                      <a:stretch>
+                        <a:fillRect/>
+                      </a:stretch>
+                    </pic:blipFill>
+                    <pic:spPr>
+                      <a:xfrm>
+                        <a:off x="0" y="0"/>
+                        <a:ext cx="5486400" cy="2286000"/>
+                      </a:xfrm>
+                      <a:prstGeom prst="rect">
+                        <a:avLst/>
+                      </a:prstGeom>
+                    </pic:spPr>
+                  </pic:pic>
+                </a:graphicData>
+              </a:graphic>
+            </wp:inline>
+          </w:drawing>
+        </w:r>
+      </w:ins>
+    </w:p>
+    <w:p>
+      <w:pPr>
+        <w:pStyle w:val="BodyText"/>
+        <w:rPr>
+          <w:ins w:id="9122" w:author="Claude" w:date="2026-10-13T00:00:00Z"/>
+        </w:rPr>
+      </w:pPr>
+      <w:ins w:id="9123" w:author="Claude" w:date="2026-10-13T00:00:00Z">
+        <w:r>
+          <w:rPr>
+            <w:b/>
+            <w:bCs/>
+          </w:rPr>
+          <w:t xml:space="preserve">Figure 2.</w:t>
+        </w:r>
+        <w:r>
+          <w:t xml:space="preserve"> Pooled age slope of bug reports under four ways of handling issue volume (Section 4.3). Specifications (b) and (d), in black, are the primary tests of H1; (a) and (c) are biased downward by the burst of issues after a release. The shaded band marks the equivalence bound of ±0.02.</w:t>
+        </w:r>
+      </w:ins>
     </w:p>
     <w:p>
       <w:pPr>
@@ -5598,7 +5745,15 @@
         <w:t xml:space="preserve">τ²</w:t>
       </w:r>
       <w:r>
-        <w:t xml:space="preserve"> = 0.049), which is not distinguishable from zero. Eight of the 19 repository-level slopes are positive. One, for vLLM, is significantly positive at the 5 percent level (a ratio of slope to standard error of about 2.4), which is about what chance alone would produce among 19 tests and does not survive a correction for multiple testing; the next largest ratio, for lm-evaluation-harness, is about 1.8 (Table 1). H2a is not supported in 18 of the 19 repositories.</w:t>
+        <w:t xml:space="preserve"> = 0.049), which is not distinguishable from zero.</w:t>
+      </w:r>
+      <w:ins w:id="9112" w:author="Claude" w:date="2026-10-13T00:00:00Z">
+        <w:r>
+          <w:t xml:space="preserve"> Figure 1b shows the repository-level slopes.</w:t>
+        </w:r>
+      </w:ins>
+      <w:r>
+        <w:t xml:space="preserve"> Eight of the 19 repository-level slopes are positive. One, for vLLM, is significantly positive at the 5 percent level (a ratio of slope to standard error of about 2.4), which is about what chance alone would produce among 19 tests and does not survive a correction for multiple testing; the next largest ratio, for lm-evaluation-harness, is about 1.8 (Table 1). H2a is not supported in 18 of the 19 repositories.</w:t>
       </w:r>
     </w:p>
     <w:p>
@@ -5684,6 +5839,11 @@
       <w:r>
         <w:t xml:space="preserve"> The three-week average of bug reports gives 0.332 (0.108; wild cluster bootstrap p = 0.01), and the three lags entered separately give 0.184, 0.096, and 0.055.</w:t>
       </w:r>
+      <w:ins w:id="9113" w:author="Claude" w:date="2026-10-13T00:00:00Z">
+        <w:r>
+          <w:t xml:space="preserve"> Figure 3a plots the main coefficients.</w:t>
+        </w:r>
+      </w:ins>
     </w:p>
     <w:p>
       <w:pPr>
@@ -5793,6 +5953,78 @@
       <w:r>
         <w:t xml:space="preserve"> = 0.051). Three repositories have a significantly positive coefficient on work age and three on calendar age in the joint specification, and none is significantly negative. The median within-repository correlation between the two ages is 0.74, and the median coefficient of variation of weekly merged pull requests is 0.83, so the data separate the two only in part. In a linear probability model with repository fixed effects, the coefficient on work age is 0.029 (cluster standard error 0.013; wild cluster bootstrap p = 0.087) and on calendar age it is −0.018 (0.011; p = 0.18).</w:t>
       </w:r>
+      <w:ins w:id="9124" w:author="Claude" w:date="2026-10-13T00:00:00Z">
+        <w:r>
+          <w:t xml:space="preserve"> Figure 3b plots the pooled coefficients.</w:t>
+        </w:r>
+      </w:ins>
+    </w:p>
+    <w:p>
+      <w:pPr>
+        <w:keepNext/>
+        <w:pStyle w:val="BodyText"/>
+        <w:spacing w:before="120" w:after="60" w:line="240" w:lineRule="auto"/>
+        <w:ind w:firstLine="0"/>
+        <w:jc w:val="center"/>
+        <w:rPr>
+          <w:ins w:id="9125" w:author="Claude" w:date="2026-10-13T00:00:00Z"/>
+        </w:rPr>
+      </w:pPr>
+      <w:ins w:id="9126" w:author="Claude" w:date="2026-10-13T00:00:00Z">
+        <w:r>
+          <w:drawing>
+            <wp:inline xmlns:wp="http://schemas.openxmlformats.org/drawingml/2006/wordprocessingDrawing" distT="0" distB="0" distL="0" distR="0">
+              <wp:extent cx="5486400" cy="2209800"/>
+              <wp:docPr id="9003" name="Figure 3" descr="Figure 3"/>
+              <a:graphic xmlns:a="http://schemas.openxmlformats.org/drawingml/2006/main">
+                <a:graphicData uri="http://schemas.openxmlformats.org/drawingml/2006/picture">
+                  <pic:pic xmlns:pic="http://schemas.openxmlformats.org/drawingml/2006/picture">
+                    <pic:nvPicPr>
+                      <pic:cNvPr id="9003" name="fig3_rq3_rq4_coefficients.png"/>
+                      <pic:cNvPicPr/>
+                    </pic:nvPicPr>
+                    <pic:blipFill>
+                      <a:blip xmlns:r="http://schemas.openxmlformats.org/officeDocument/2006/relationships" r:embed="rId9003"/>
+                      <a:stretch>
+                        <a:fillRect/>
+                      </a:stretch>
+                    </pic:blipFill>
+                    <pic:spPr>
+                      <a:xfrm>
+                        <a:off x="0" y="0"/>
+                        <a:ext cx="5486400" cy="2209800"/>
+                      </a:xfrm>
+                      <a:prstGeom prst="rect">
+                        <a:avLst/>
+                      </a:prstGeom>
+                    </pic:spPr>
+                  </pic:pic>
+                </a:graphicData>
+              </a:graphic>
+            </wp:inline>
+          </w:drawing>
+        </w:r>
+      </w:ins>
+    </w:p>
+    <w:p>
+      <w:pPr>
+        <w:pStyle w:val="BodyText"/>
+        <w:rPr>
+          <w:ins w:id="9127" w:author="Claude" w:date="2026-10-13T00:00:00Z"/>
+        </w:rPr>
+      </w:pPr>
+      <w:ins w:id="9128" w:author="Claude" w:date="2026-10-13T00:00:00Z">
+        <w:r>
+          <w:rPr>
+            <w:b/>
+            <w:bCs/>
+          </w:rPr>
+          <w:t xml:space="preserve">Figure 3.</w:t>
+        </w:r>
+        <w:r>
+          <w:t xml:space="preserve"> (a) Response of the release hazard to issues in the previous week, holding non-bug issues or total issues fixed (Section 5.3). (b) Pooled coefficients on work age and calendar age in the regular-release hazard, entered alone and jointly (Section 5.5).</w:t>
+        </w:r>
+      </w:ins>
     </w:p>
     <w:p>
       <w:pPr>

</xml_diff>

<commit_message>
Insert receiver-side analysis into manuscript (4.3 method, new 5.7, 6.3 limitation) as tracked changes
Co-Authored-By: Claude Sonnet 5.5 <noreply@anthropic.com>
Claude-Session: https://claude.ai/code/session_017rpe9Z3CoCCyiANf2szbvW
</commit_message>
<xml_diff>
--- a/isr-revision/manuscript/Manuscript_ISR_Format_tracked.docx
+++ b/isr-revision/manuscript/Manuscript_ISR_Format_tracked.docx
@@ -5454,6 +5454,66 @@
       <w:r>
         <w:t xml:space="preserve"> We estimate a stacked event study. For each launch, repositories exposed to it are treated and repositories not exposed to that type of launch are controls, using only clean controls, with a window of four weeks before and eight weeks after the launch. The outcome is whether a release appears in the repository-week, and the specification includes repository-by-event and week-by-event fixed effects. We report the average effect in weeks 0 to 4 and weeks 5 to 8, event-time coefficients with week −1 omitted, a Wald test of the pre-launch coefficients, and wild cluster bootstrap p-values (Webb weights; clusters are repositories). To see whether the content of releases responds, we also count release notes that mention the launched model by keyword in the eight weeks before and after each launch in exposed repositories.</w:t>
       </w:r>
+    </w:p>
+    <w:p>
+      <w:pPr>
+        <w:pStyle w:val="BodyText"/>
+        <w:rPr>
+          <w:ins w:id="9129" w:author="Claude" w:date="2026-10-13T00:00:00Z"/>
+        </w:rPr>
+      </w:pPr>
+      <w:ins w:id="9130" w:author="Claude" w:date="2026-10-13T00:00:00Z">
+        <w:r>
+          <w:rPr>
+            <w:b/>
+            <w:bCs/>
+          </w:rPr>
+          <w:t xml:space="preserve">Receivers of the signal.</w:t>
+        </w:r>
+        <w:r>
+          <w:t xml:space="preserve"> Sections 5.1 to 5.5 test whether release timing is correlated with degradation. Signaling also requires that receivers act on the signal. We therefore ask whether adoption responds to release cadence and whether it responds differently to releases that follow a surge in bug reports. For each repository-week we measure adoption growth as the change in log mean weekly PyPI downloads between weeks </w:t>
+        </w:r>
+        <w:r>
+          <w:rPr>
+            <w:i/>
+            <w:iCs/>
+          </w:rPr>
+          <w:t xml:space="preserve">t</w:t>
+        </w:r>
+        <w:r>
+          <w:t xml:space="preserve">−3 to </w:t>
+        </w:r>
+        <w:r>
+          <w:rPr>
+            <w:i/>
+            <w:iCs/>
+          </w:rPr>
+          <w:t xml:space="preserve">t</w:t>
+        </w:r>
+        <w:r>
+          <w:t xml:space="preserve"> and weeks </w:t>
+        </w:r>
+        <w:r>
+          <w:rPr>
+            <w:i/>
+            <w:iCs/>
+          </w:rPr>
+          <w:t xml:space="preserve">t</w:t>
+        </w:r>
+        <w:r>
+          <w:t xml:space="preserve">+1 to </w:t>
+        </w:r>
+        <w:r>
+          <w:rPr>
+            <w:i/>
+            <w:iCs/>
+          </w:rPr>
+          <w:t xml:space="preserve">t</w:t>
+        </w:r>
+        <w:r>
+          <w:t xml:space="preserve">+4, and, for all 19 repositories, the corresponding change in log new GitHub stars from GH Archive. Three repositories (whisper.cpp, text-generation-inference, and ollama) have no PyPI artifact and enter only the star models. The regressors are the number of releases in the trailing eight weeks, the number of those releases that follow a week whose bug share exceeded the repository's median, the number of hot-fix releases in the same window, and the log of issues in the window as a control for project activity, together with the outcome measured four weeks earlier and repository and week fixed effects. Because total releases are in the model, the coefficient on bug-preceded releases is the additional response of adoption to a release that follows a bug surge, relative to any other release. Standard errors are clustered by repository, and p-values come from a wild cluster restricted bootstrap with Webb weights. Adoption and releases share momentum, so these estimates describe how receivers' behavior covaries with cadence and are not causal.</w:t>
+        </w:r>
+      </w:ins>
     </w:p>
     <w:p>
       <w:pPr>
@@ -6115,6 +6175,32 @@
     </w:p>
     <w:p>
       <w:pPr>
+        <w:pStyle w:val="Heading3"/>
+        <w:rPr>
+          <w:ins w:id="9131" w:author="Claude" w:date="2026-10-13T00:00:00Z"/>
+        </w:rPr>
+      </w:pPr>
+      <w:ins w:id="9132" w:author="Claude" w:date="2026-10-13T00:00:00Z">
+        <w:r>
+          <w:t xml:space="preserve">5.7. Receivers: Does Adoption Respond to Cadence?</w:t>
+        </w:r>
+      </w:ins>
+    </w:p>
+    <w:p>
+      <w:pPr>
+        <w:pStyle w:val="FirstParagraph"/>
+        <w:rPr>
+          <w:ins w:id="9133" w:author="Claude" w:date="2026-10-13T00:00:00Z"/>
+        </w:rPr>
+      </w:pPr>
+      <w:ins w:id="9134" w:author="Claude" w:date="2026-10-13T00:00:00Z">
+        <w:r>
+          <w:t xml:space="preserve">We find no detectable response of adoption to release cadence. One standard deviation more releases in the trailing eight weeks is followed by a change of −0.008 in log download growth (clustered SE 0.034; wild cluster bootstrap p = 0.94) and of 0.047 in log star growth (SE 0.025; p = 0.10). The additional response to releases that follow a bug surge is −0.031 (p = 0.35) for downloads and −0.027 (p = 0.16) for stars, and that to hot-fixes is 0.020 (p = 0.63) and −0.020 (p = 0.66). In one of the six estimates of the response to releases, the star model that adds bug-preceded releases, the coefficient is 0.067 with a bootstrap p-value of 0.049; we do not read it as a finding, given the number of specifications we report and the estimate of 0.047 (p = 0.10) in the model without that term. With 16 clusters for downloads and 19 for stars, the minimum detectable effect at 80 percent power is about 0.09 and 0.07 log points per standard deviation, so the result does not show that receivers ignore cadence, only that adoption at weekly frequency does not reveal it. The argument of Section 2.4 then rests on the documented use of cadence in project-health assessments rather than on revealed behavior, and we say so in Section 6.3.</w:t>
+        </w:r>
+      </w:ins>
+    </w:p>
+    <w:p>
+      <w:pPr>
         <w:pStyle w:val="Heading2"/>
       </w:pPr>
       <w:r>
@@ -6384,6 +6470,26 @@
     <w:p>
       <w:pPr>
         <w:pStyle w:val="BodyText"/>
+        <w:rPr>
+          <w:ins w:id="9135" w:author="Claude" w:date="2026-10-13T00:00:00Z"/>
+        </w:rPr>
+      </w:pPr>
+      <w:ins w:id="9136" w:author="Claude" w:date="2026-10-13T00:00:00Z">
+        <w:r>
+          <w:rPr>
+            <w:b/>
+            <w:bCs/>
+          </w:rPr>
+          <w:t xml:space="preserve">Adoption measures.</w:t>
+        </w:r>
+        <w:r>
+          <w:t xml:space="preserve"> The receiver-side analysis uses downloads and stars as measures of adoption. Downloads include mirrors and continuous-integration installs, stars measure attention more than use, three repositories have no PyPI artifact, and the PyPI counts of TensorRT-LLM are incomplete because early versions were distributed through the NVIDIA package index. Adoption and releases are both driven by project momentum, which the lagged outcome and the issue control absorb only in part.</w:t>
+        </w:r>
+      </w:ins>
+    </w:p>
+    <w:p>
+      <w:pPr>
+        <w:pStyle w:val="BodyText"/>
       </w:pPr>
       <w:r>
         <w:rPr>
@@ -6393,7 +6499,20 @@
         <w:t xml:space="preserve">Reproducibility.</w:t>
       </w:r>
       <w:r>
-        <w:t xml:space="preserve"> Collection depends on the state of the GitHub API at the time of collection, since issues can be edited or deleted afterward, and for this reason the replication package includes the weekly aggregates we used. The package also contains the scripts that produce the empirical estimates in Sections 5.1 to 5.6 and in Table 1, run with fixed random seeds and 999 bootstrap draws.</w:t>
+        <w:t xml:space="preserve"> Collection depends on the state of the GitHub API at the time of collection, since issues can be edited or deleted afterward, and for this reason the replication package includes the weekly aggregates we used. The package also contains the scripts that produce the empirical estimates </w:t>
+      </w:r>
+      <w:del w:id="9137" w:author="Claude" w:date="2026-10-13T00:00:00Z">
+        <w:r>
+          <w:delText xml:space="preserve">in Sections 5.1 to 5.6 and in Table 1</w:delText>
+        </w:r>
+      </w:del>
+      <w:ins w:id="9138" w:author="Claude" w:date="2026-10-13T00:00:00Z">
+        <w:r>
+          <w:t xml:space="preserve">in Sections 5.1 to 5.7 and in Table 1</w:t>
+        </w:r>
+      </w:ins>
+      <w:r>
+        <w:t xml:space="preserve">, run with fixed random seeds and 999 bootstrap draws.</w:t>
       </w:r>
     </w:p>
     <w:p>

</xml_diff>

<commit_message>
Revise launch conclusion: short-run response at daily resolution (abstract, intro, 4.3, 5.4, 6, conclusion) as tracked changes
Co-Authored-By: Claude Sonnet 5.5 <noreply@anthropic.com>
Claude-Session: https://claude.ai/code/session_017rpe9Z3CoCCyiANf2szbvW
</commit_message>
<xml_diff>
--- a/isr-revision/manuscript/Manuscript_ISR_Format_tracked.docx
+++ b/isr-revision/manuscript/Manuscript_ISR_Format_tracked.docx
@@ -23,7 +23,20 @@
         <w:pStyle w:val="FirstParagraph"/>
       </w:pPr>
       <w:r>
-        <w:t xml:space="preserve">Organizations increasingly deploy systems built on large language models and are expected to refresh them as the world drifts away from their training data, yet little is known about what triggers a refresh. Release frequency is widely read as a signal of responsive maintenance. Drawing on signaling theory and on the distinction between state-dependent and time-dependent adjustment in price setting, we derive from a Poisson model of accumulating errors when cadence would be a valid signal, and test the implications on weekly issue, release, pull-request, and commit histories for 19 widely used open-source repositories in the LLM tooling ecosystem (3,432 repository-weeks; 2,456 releases). Bug reports show no measurable rise with the time since the last release relative to total issues, although a modest accumulation of up to about 3.9 percent per week cannot be excluded once the post-release burst of attention is absorbed. Release probabilities rise with the volume of user issues but show no significant additional response to bug reports at a given volume, and no detectable response to 38 upstream model launches. The release hazard also tends to rise with the stock of merged changes, although the data cannot cleanly separate that stock from calendar time. Release cadence therefore </w:t>
+        <w:t xml:space="preserve">Organizations increasingly deploy systems built on large language models and are expected to refresh them as the world drifts away from their training data, yet little is known about what triggers a refresh. Release frequency is widely read as a signal of responsive maintenance. Drawing on signaling theory and on the distinction between state-dependent and time-dependent adjustment in price setting, we derive from a Poisson model of accumulating errors when cadence would be a valid signal, and test the implications on weekly issue, release, pull-request, and commit histories for 19 widely used open-source repositories in the LLM tooling ecosystem (3,432 repository-weeks; 2,456 releases). Bug reports show no measurable rise with the time since the last release relative to total issues, although a modest accumulation of up to about 3.9 percent per week cannot be excluded once the post-release burst of attention is absorbed. Release probabilities rise with the volume of user issues but show no significant additional response to bug reports at a given volume</w:t>
+      </w:r>
+      <w:del w:id="9143" w:author="Claude" w:date="2026-10-13T00:00:00Z">
+        <w:r>
+          <w:delText xml:space="preserve">, and no detectable response to 38 upstream model launches.</w:delText>
+        </w:r>
+      </w:del>
+      <w:ins w:id="9144" w:author="Claude" w:date="2026-10-13T00:00:00Z">
+        <w:r>
+          <w:t xml:space="preserve">. Repositories exposed to one of 38 upstream model launches release sooner in the days after it, a response that weekly data do not show.</w:t>
+        </w:r>
+      </w:ins>
+      <w:r>
+        <w:t xml:space="preserve"> The release hazard also tends to rise with the stock of merged changes, although the data cannot cleanly separate that stock from calendar time. Release cadence therefore </w:t>
       </w:r>
       <w:del w:id="9001" w:author="Claude" w:date="2026-10-13T00:00:00Z">
         <w:r>
@@ -32,7 +45,7 @@
       </w:del>
       <w:ins w:id="9002" w:author="Claude" w:date="2026-10-13T00:00:00Z">
         <w:r>
-          <w:t xml:space="preserve">carries information about responsiveness to users and to accumulated work, but the data do not identify it as a signal of responsiveness to degradation specifically</w:t>
+          <w:t xml:space="preserve">carries information about responsiveness to users, to upstream launches, and to accumulated work, but the data do not identify it as a signal of responsiveness to degradation specifically</w:t>
         </w:r>
       </w:ins>
       <w:r>
@@ -101,8 +114,18 @@
           <w:t xml:space="preserve">user issues, but a response to bug reports cannot be distinguished from a response to overall issue volume</w:t>
         </w:r>
       </w:ins>
-      <w:r>
-        <w:t xml:space="preserve">, and they show no detectable response to upstream model launches. Release timing also tends to track the accumulation of merged work. Release cadence therefore looks more like a signal of </w:t>
+      <w:del w:id="9145" w:author="Claude" w:date="2026-10-13T00:00:00Z">
+        <w:r>
+          <w:delText xml:space="preserve">, and they show no detectable response to upstream model launches.</w:delText>
+        </w:r>
+      </w:del>
+      <w:ins w:id="9146" w:author="Claude" w:date="2026-10-13T00:00:00Z">
+        <w:r>
+          <w:t xml:space="preserve">, and they respond within days to upstream model launches.</w:t>
+        </w:r>
+      </w:ins>
+      <w:r>
+        <w:t xml:space="preserve"> Release timing also tends to track the accumulation of merged work. Release cadence therefore looks more like a signal of </w:t>
       </w:r>
       <w:del w:id="9007" w:author="Claude" w:date="2026-10-13T00:00:00Z">
         <w:r>
@@ -111,7 +134,7 @@
       </w:del>
       <w:ins w:id="9008" w:author="Claude" w:date="2026-10-13T00:00:00Z">
         <w:r>
-          <w:t xml:space="preserve">responsiveness to users and to development work than a signal of responsiveness to system deterioration specifically</w:t>
+          <w:t xml:space="preserve">responsiveness to users, to upstream launches, and to development work than a signal of responsiveness to system deterioration specifically</w:t>
         </w:r>
       </w:ins>
       <w:r>
@@ -278,9 +301,16 @@
           <w:t xml:space="preserve">Because bug reports are part of total issues, this last comparison is conservative, and its interval does not exclude a sizable additional response. Releases</w:t>
         </w:r>
       </w:ins>
-      <w:r>
-        <w:t xml:space="preserve"> show no detectable response to 38 upstream model launches, although release notes often mention a new model after its launch, which suggests that the content of releases responds while their timing does not. </w:t>
-      </w:r>
+      <w:del w:id="9147" w:author="Claude" w:date="2026-10-13T00:00:00Z">
+        <w:r>
+          <w:delText xml:space="preserve"> show no detectable response to 38 upstream model launches, although release notes often mention a new model after its launch, which suggests that the content of releases responds while their timing does not. </w:delText>
+        </w:r>
+      </w:del>
+      <w:ins w:id="9148" w:author="Claude" w:date="2026-10-13T00:00:00Z">
+        <w:r>
+          <w:t xml:space="preserve"> respond to 38 upstream model launches in the days after them. Exposed repositories are 17.5 percentage points more likely to release within one day of a launch than unexposed repositories (placebo-based p = 0.008), and the mean time to the next release is 3.4 days shorter (p = 0.02); the response is larger when controls exposed to other launches are excluded, and a weekly indicator misses it. Timing alone cannot show whether these releases address degradation or add support for the new model. </w:t>
+        </w:r>
+      </w:ins>
     </w:p>
     <w:p>
       <w:pPr>
@@ -309,11 +339,21 @@
       </w:del>
       <w:ins w:id="9018" w:author="Claude" w:date="2026-10-13T00:00:00Z">
         <w:r>
-          <w:t xml:space="preserve">user issues without a response to bug reports that can be distinguished from a response to overall volume, that their timing shows no detectable response</w:t>
+          <w:t xml:space="preserve">user issues without a response to bug reports that can be distinguished from a response to overall volume, that their timing responds</w:t>
         </w:r>
       </w:ins>
-      <w:r>
-        <w:t xml:space="preserve"> to upstream launches, and that they tend to follow accumulating work (Section 5). Fourth, it draws out implications for the design of monitoring and governance of deployed AI. Release cadence is not by itself evidence that degradation is being managed, and detecting degradation requires performance data that public repositories do not contain; this has implications for post-market monitoring under frameworks such as the EU AI Act and for organizations that depend on third-party AI components, although our evidence concerns the tooling layer and not deployed models (Section 6). A replication package accompanies the paper.</w:t>
+      <w:del w:id="9149" w:author="Claude" w:date="2026-10-13T00:00:00Z">
+        <w:r>
+          <w:delText xml:space="preserve"> to upstream launches, and that they tend to follow</w:delText>
+        </w:r>
+      </w:del>
+      <w:ins w:id="9150" w:author="Claude" w:date="2026-10-13T00:00:00Z">
+        <w:r>
+          <w:t xml:space="preserve"> to upstream launches within days but not in weekly data, and that they tend to follow</w:t>
+        </w:r>
+      </w:ins>
+      <w:r>
+        <w:t xml:space="preserve"> accumulating work (Section 5). Fourth, it draws out implications for the design of monitoring and governance of deployed AI. Release cadence is not by itself evidence that degradation is being managed, and detecting degradation requires performance data that public repositories do not contain; this has implications for post-market monitoring under frameworks such as the EU AI Act and for organizations that depend on third-party AI components, although our evidence concerns the tooling layer and not deployed models (Section 6). A replication package accompanies the paper.</w:t>
       </w:r>
     </w:p>
     <w:p>
@@ -5454,6 +5494,46 @@
       <w:r>
         <w:t xml:space="preserve"> We estimate a stacked event study. For each launch, repositories exposed to it are treated and repositories not exposed to that type of launch are controls, using only clean controls, with a window of four weeks before and eight weeks after the launch. The outcome is whether a release appears in the repository-week, and the specification includes repository-by-event and week-by-event fixed effects. We report the average effect in weeks 0 to 4 and weeks 5 to 8, event-time coefficients with week −1 omitted, a Wald test of the pre-launch coefficients, and wild cluster bootstrap p-values (Webb weights; clusters are repositories). To see whether the content of releases responds, we also count release notes that mention the launched model by keyword in the eight weeks before and after each launch in exposed repositories.</w:t>
       </w:r>
+    </w:p>
+    <w:p>
+      <w:pPr>
+        <w:pStyle w:val="BodyText"/>
+        <w:rPr>
+          <w:ins w:id="9169" w:author="Claude" w:date="2026-10-13T00:00:00Z"/>
+        </w:rPr>
+      </w:pPr>
+      <w:ins w:id="9170" w:author="Claude" w:date="2026-10-13T00:00:00Z">
+        <w:r>
+          <w:rPr>
+            <w:b/>
+            <w:bCs/>
+          </w:rPr>
+          <w:t xml:space="preserve">Upstream launches at daily resolution.</w:t>
+        </w:r>
+        <w:r>
+          <w:t xml:space="preserve"> A weekly indicator is a coarse measure of timing when the weekly release rate in treated blocks is about 0.42 and client SDKs often release on the day a model is announced. We therefore also measure timing in days. Day 0 is the date of the public announcement. For each launch and each repository that had released at least once in the preceding 90 days, we record the number of days until the next release, and we compare exposed and unexposed repositories in two ways: the difference in the share that release within </w:t>
+        </w:r>
+        <w:r>
+          <w:rPr>
+            <w:i/>
+            <w:iCs/>
+          </w:rPr>
+          <w:t xml:space="preserve">k</w:t>
+        </w:r>
+        <w:r>
+          <w:t xml:space="preserve"> days (</w:t>
+        </w:r>
+        <w:r>
+          <w:rPr>
+            <w:i/>
+            <w:iCs/>
+          </w:rPr>
+          <w:t xml:space="preserve">k</w:t>
+        </w:r>
+        <w:r>
+          <w:t xml:space="preserve"> = 0, 1, 3, 7, 14, 28), and the difference in the restricted mean time to the next release, truncated at 28 days. Both are averaged over launches with equal weight. Inference is by randomization: we replace each launch date with a placebo date drawn from days at least 14 days away from any real launch, keep the launch's type and therefore its exposed and unexposed sets, recompute the statistics, and repeat 999 times. The placebo distribution absorbs any baseline difference in release rates between exposed and unexposed repositories, and the p-value is the share of placebo statistics at least as far from the placebo mean as the observed statistic. To compare timing with content, we also record, for exposed repositories, the days until the first release whose notes mention the launched model, and whether that release is the first release after the launch. We also report a version in which controls that are exposed to another launch within the window are dropped.</w:t>
+        </w:r>
+      </w:ins>
     </w:p>
     <w:p>
       <w:pPr>
@@ -5938,9 +6018,16 @@
       <w:pPr>
         <w:pStyle w:val="Heading3"/>
       </w:pPr>
-      <w:r>
-        <w:t xml:space="preserve">5.4. RQ3: No Detectable Release Response to Upstream Model Launches</w:t>
-      </w:r>
+      <w:del w:id="9139" w:author="Claude" w:date="2026-10-13T00:00:00Z">
+        <w:r>
+          <w:delText xml:space="preserve">5.4. RQ3: No Detectable Release Response to Upstream Model Launches</w:delText>
+        </w:r>
+      </w:del>
+      <w:ins w:id="9140" w:author="Claude" w:date="2026-10-13T00:00:00Z">
+        <w:r>
+          <w:t xml:space="preserve">5.4. RQ3: A Short-Run Release Response to Upstream Model Launches</w:t>
+        </w:r>
+      </w:ins>
     </w:p>
     <w:p>
       <w:pPr>
@@ -5952,11 +6039,41 @@
     </w:p>
     <w:p>
       <w:pPr>
+        <w:pStyle w:val="BodyText"/>
+        <w:rPr>
+          <w:ins w:id="9171" w:author="Claude" w:date="2026-10-13T00:00:00Z"/>
+        </w:rPr>
+      </w:pPr>
+      <w:ins w:id="9172" w:author="Claude" w:date="2026-10-13T00:00:00Z">
+        <w:r>
+          <w:rPr>
+            <w:b/>
+            <w:bCs/>
+          </w:rPr>
+          <w:t xml:space="preserve">Daily resolution.</w:t>
+        </w:r>
+        <w:r>
+          <w:t xml:space="preserve"> Measured in days, exposed repositories release sooner after a launch than unexposed repositories do. Among the 277 repository-launch pairs in which the repository had released in the preceding 90 days, the share that release within one day of the announcement is 17.5 percentage points higher for exposed than for unexposed repositories, against 4.8 points on average at placebo launch dates (placebo 95 percent range −3.4 to 12.9; randomization p = 0.008). The differences are 11.2 points on the day of the launch (p = 0.03), 15.5 within three days (p = 0.04), 13.9 within 14 days (p = 0.03), and 7.0 within 28 days (p = 0.15), and the mean time to the next release, truncated at 28 days, is 3.4 days shorter (p = 0.02). The seven statistics are not independent, and a Bonferroni correction for seven comparisons raises the smallest p-value in this specification to 0.06. When controls that are exposed to another launch within the window are dropped, the differences are larger and last longer: 22.2 points within one day (p = 0.001), 21.2 within seven days (p = 0.01), 15.4 within 28 days (p = 0.009), and 5.9 days in the mean time to the next release (p = 0.001). The weekly estimates miss this response because a weekly indicator is close to saturation when the weekly release rate is 0.42, and client SDKs often release on the day a model is announced. Releases therefore do respond to a change in their environment, which is a form of state dependence. Timing alone cannot show whether a release shortly after a launch addresses degradation or adds support for the new model; the release notes below suggest that adding support is at least part of it.</w:t>
+        </w:r>
+      </w:ins>
+    </w:p>
+    <w:p>
+      <w:pPr>
         <w:pStyle w:val="FirstParagraph"/>
       </w:pPr>
       <w:r>
-        <w:t xml:space="preserve">Release notes do mention new models. In exposed repositories, 143 of 334 repository-launch pairs (42.8 percent) have at least one release within eight weeks after the launch that mentions the launched model; the median delay is 10 days (interquartile range 1 to 24); and 287 of 1,901 releases after launch mention it, against 26 of 1,871 releases before. The match is by keyword and we have not validated it by hand, so some matches may be false positives. If most are correct, the pattern is consistent with the content of releases responding to a launch while their timing does not: support for a new model is shipped in releases that would probably have appeared anyway. H4 is not supported by the upstream signal either.</w:t>
-      </w:r>
+        <w:t xml:space="preserve">Release notes do mention new models. In exposed repositories, 143 of 334 repository-launch pairs (42.8 percent) have at least one release within eight weeks after the launch that mentions the launched model; the median delay is 10 days (interquartile range 1 to 24); and 287 of 1,901 releases after launch mention it, against 26 of 1,871 releases before. The match is by keyword and we have not validated it by hand, so some matches may be false positives. </w:t>
+      </w:r>
+      <w:del w:id="9141" w:author="Claude" w:date="2026-10-13T00:00:00Z">
+        <w:r>
+          <w:delText xml:space="preserve">If most are correct, the pattern is consistent with the content of releases responding to a launch while their timing does not: support for a new model is shipped in releases that would probably have appeared anyway. H4 is not supported by the upstream signal either.</w:delText>
+        </w:r>
+      </w:del>
+      <w:ins w:id="9142" w:author="Claude" w:date="2026-10-13T00:00:00Z">
+        <w:r>
+          <w:t xml:space="preserve">If most are correct, the pattern is consistent with releases being brought forward to ship support for a new model. H4 is supported by the upstream signal at daily resolution but not at weekly resolution, and the response is better read as one to a change in the environment than as a response to degradation in the sense of Section 3.</w:t>
+        </w:r>
+      </w:ins>
     </w:p>
     <w:p>
       <w:pPr>
@@ -6142,7 +6259,20 @@
         <w:t xml:space="preserve">Equivalence. </w:t>
       </w:r>
       <w:r>
-        <w:t xml:space="preserve">For the age slope of bug reports under specification (b), the pooled estimate (−0.003, SE 0.006) is statistically equivalent to zero within ±0.02 log points per week (TOST p = 0.004). Equivalence would hold for any bound above 0.013, and the minimum effect detectable with 80 percent power is 0.018. Under specification (d) equivalence at that bound is not established (estimate 0.017, SE 0.010; TOST p = 0.40; equivalence for any bound above 0.035; minimum detectable effect 0.029). For the launch event study the estimate (−0.002, SE 0.018) is equivalent to zero within ±5 percentage points (TOST p = 0.004; smallest bound 0.032; minimum detectable effect 0.050). For the one-week response to bug reports, equivalence within ±0.25 log-odds per standard deviation is not established, with total issues held fixed (estimate 0.191, SE 0.123; TOST p = 0.32; smallest bound 0.39) or with non-bug issues held fixed (0.261, SE 0.095; TOST p = 0.55; smallest bound 0.42), as expected when the estimates are themselves positive. The bounds are anchored to the data, which is why the smallest bound for equivalence is reported as well.</w:t>
+        <w:t xml:space="preserve">For the age slope of bug reports under specification (b), the pooled estimate (−0.003, SE 0.006) is statistically equivalent to zero within ±0.02 log points per week (TOST p = 0.004). Equivalence would hold for any bound above 0.013, and the minimum effect detectable with 80 percent power is 0.018. Under specification (d) equivalence at that bound is not established (estimate 0.017, SE 0.010; TOST p = 0.40; equivalence for any bound above 0.035; minimum detectable effect 0.029). </w:t>
+      </w:r>
+      <w:del w:id="9167" w:author="Claude" w:date="2026-10-13T00:00:00Z">
+        <w:r>
+          <w:delText xml:space="preserve">For the launch event study the estimate</w:delText>
+        </w:r>
+      </w:del>
+      <w:ins w:id="9168" w:author="Claude" w:date="2026-10-13T00:00:00Z">
+        <w:r>
+          <w:t xml:space="preserve">For the weekly launch event study the estimate</w:t>
+        </w:r>
+      </w:ins>
+      <w:r>
+        <w:t xml:space="preserve"> (−0.002, SE 0.018) is equivalent to zero within ±5 percentage points (TOST p = 0.004; smallest bound 0.032; minimum detectable effect 0.050). For the one-week response to bug reports, equivalence within ±0.25 log-odds per standard deviation is not established, with total issues held fixed (estimate 0.191, SE 0.123; TOST p = 0.32; smallest bound 0.39) or with non-bug issues held fixed (0.261, SE 0.095; TOST p = 0.55; smallest bound 0.42), as expected when the estimates are themselves positive. The bounds are anchored to the data, which is why the smallest bound for equivalence is reported as well.</w:t>
       </w:r>
     </w:p>
     <w:p>
@@ -6220,7 +6350,46 @@
         <w:pStyle w:val="FirstParagraph"/>
       </w:pPr>
       <w:r>
-        <w:t xml:space="preserve">Releases in these repositories respond to the volume of user activity and, more weakly, to accumulated work, but we find no clear relationship with an accumulating error state. Bug reports do not rise measurably with the age of a release relative to total issues, although a modest accumulation cannot be excluded once the post-release burst is absorbed. Release probabilities rise with the volume of user issues without a distinguishable extra response to bug reports, releases show no detectable response to upstream model launches, and the release hazard tends to rise with the stock of merged changes. These findings suggest that the observable timing of maintenance need not form a feedback loop with system deterioration. This qualifies models that treat maintenance as a responsive, state-dependent control process: such models are valid only when an accumulating error state exists and maintainers respond to it, conditions that are not clearly met in these data. The evidence is consistent with release activity in this ecosystem mainly reflecting user activity and the accumulation of development work. This distinction has implications for how information systems researchers conceptualize monitoring, feedback, and control in AI-enabled systems. In particular, treating release cadence as a validated signal of responsiveness </w:t>
+        <w:t xml:space="preserve">Releases in these repositories </w:t>
+      </w:r>
+      <w:del w:id="9151" w:author="Claude" w:date="2026-10-13T00:00:00Z">
+        <w:r>
+          <w:delText xml:space="preserve">respond to the volume of user activity and, more weakly, to accumulated work</w:delText>
+        </w:r>
+      </w:del>
+      <w:ins w:id="9152" w:author="Claude" w:date="2026-10-13T00:00:00Z">
+        <w:r>
+          <w:t xml:space="preserve">respond to the volume of user activity, to upstream model launches, and, more weakly, to accumulated work</w:t>
+        </w:r>
+      </w:ins>
+      <w:r>
+        <w:t xml:space="preserve">, but we find no clear relationship with an accumulating error state. Bug reports do not rise measurably with the age of a release relative to total issues, although a modest accumulation cannot be excluded once the post-release burst is absorbed. Release probabilities rise with the volume of user issues without a distinguishable extra response to bug reports, </w:t>
+      </w:r>
+      <w:del w:id="9153" w:author="Claude" w:date="2026-10-13T00:00:00Z">
+        <w:r>
+          <w:delText xml:space="preserve">releases show no detectable response to upstream model launches, and the release hazard tends to rise</w:delText>
+        </w:r>
+      </w:del>
+      <w:ins w:id="9154" w:author="Claude" w:date="2026-10-13T00:00:00Z">
+        <w:r>
+          <w:t xml:space="preserve">releases respond to upstream model launches within days, and the release hazard tends to rise</w:t>
+        </w:r>
+      </w:ins>
+      <w:r>
+        <w:t xml:space="preserve"> with the stock of merged changes. These findings suggest that the observable timing of maintenance need not form a feedback loop with system deterioration. This qualifies models that treat maintenance as a responsive, state-dependent control process: such models are valid only when an accumulating error state exists and maintainers respond to it, conditions that are not clearly met in these data. The evidence is consistent with release activity in this ecosystem </w:t>
+      </w:r>
+      <w:del w:id="9155" w:author="Claude" w:date="2026-10-13T00:00:00Z">
+        <w:r>
+          <w:delText xml:space="preserve">mainly reflecting user activity and the accumulation of development work</w:delText>
+        </w:r>
+      </w:del>
+      <w:ins w:id="9156" w:author="Claude" w:date="2026-10-13T00:00:00Z">
+        <w:r>
+          <w:t xml:space="preserve">mainly reflecting user activity, upstream launches, and the accumulation of development work</w:t>
+        </w:r>
+      </w:ins>
+      <w:r>
+        <w:t xml:space="preserve">. This distinction has implications for how information systems researchers conceptualize monitoring, feedback, and control in AI-enabled systems. In particular, treating release cadence as a validated signal of responsiveness </w:t>
       </w:r>
       <w:del w:id="9027" w:author="Claude" w:date="2026-10-13T00:00:00Z">
         <w:r>
@@ -6229,7 +6398,7 @@
       </w:del>
       <w:ins w:id="9028" w:author="Claude" w:date="2026-10-13T00:00:00Z">
         <w:r>
-          <w:t xml:space="preserve">to degradation conflates responsiveness to users and to development work with a control response to deterioration</w:t>
+          <w:t xml:space="preserve">to degradation conflates responsiveness to users, to upstream launches, and to development work with a control response to deterioration</w:t>
         </w:r>
       </w:ins>
       <w:r>
@@ -6249,7 +6418,20 @@
         <w:pStyle w:val="FirstParagraph"/>
       </w:pPr>
       <w:r>
-        <w:t xml:space="preserve">In this ecosystem, we find no evidence that release timing is a mechanism through which degradation, if it occurs, would be corrected, although releases do respond to the flow of user reports. In the language of signaling theory, release cadence </w:t>
+        <w:t xml:space="preserve">In this ecosystem, we find no evidence that release timing is a mechanism through which degradation, if it occurs, would be corrected, </w:t>
+      </w:r>
+      <w:del w:id="9165" w:author="Claude" w:date="2026-10-13T00:00:00Z">
+        <w:r>
+          <w:delText xml:space="preserve">although releases do respond to the flow of user reports.</w:delText>
+        </w:r>
+      </w:del>
+      <w:ins w:id="9166" w:author="Claude" w:date="2026-10-13T00:00:00Z">
+        <w:r>
+          <w:t xml:space="preserve">although releases do respond to the flow of user reports and, within days, to upstream launches.</w:t>
+        </w:r>
+      </w:ins>
+      <w:r>
+        <w:t xml:space="preserve"> In the language of signaling theory, release cadence </w:t>
       </w:r>
       <w:del w:id="9029" w:author="Claude" w:date="2026-10-13T00:00:00Z">
         <w:r>
@@ -6258,7 +6440,7 @@
       </w:del>
       <w:ins w:id="9030" w:author="Claude" w:date="2026-10-13T00:00:00Z">
         <w:r>
-          <w:t xml:space="preserve">meets the correlation condition for responsiveness to users, but the data do not show that it meets it for responsiveness to degradation: it covaries with user activity in general, and its additional covariation with defects cannot be distinguished from zero</w:t>
+          <w:t xml:space="preserve">meets the correlation condition for responsiveness to users, but the data do not show that it meets it for responsiveness to degradation: it covaries with user activity in general and with upstream launches, and its additional covariation with defects cannot be distinguished from zero</w:t>
         </w:r>
       </w:ins>
       <w:r>
@@ -6310,7 +6492,20 @@
         <w:t xml:space="preserve">.</w:t>
       </w:r>
       <w:r>
-        <w:t xml:space="preserve"> A project that releases every week looks actively maintained, but if release timing follows user activity, accumulated work, or the calendar, it need not respond to degradation. Buyers, auditors, and regulators that use update frequency as an indicator of maintenance quality should not read it as evidence that degradation is being corrected. These implications concern the open-source tooling layer that we study; whether operators of hosted models behave similarly is an empirical question that public repositories cannot answer.</w:t>
+        <w:t xml:space="preserve"> A project that releases every week looks actively maintained, but if release timing </w:t>
+      </w:r>
+      <w:del w:id="9157" w:author="Claude" w:date="2026-10-13T00:00:00Z">
+        <w:r>
+          <w:delText xml:space="preserve">follows user activity, accumulated work, or the calendar</w:delText>
+        </w:r>
+      </w:del>
+      <w:ins w:id="9158" w:author="Claude" w:date="2026-10-13T00:00:00Z">
+        <w:r>
+          <w:t xml:space="preserve">follows user activity, upstream launches, accumulated work, or the calendar</w:t>
+        </w:r>
+      </w:ins>
+      <w:r>
+        <w:t xml:space="preserve">, it need not respond to degradation. Buyers, auditors, and regulators that use update frequency as an indicator of maintenance quality should not read it as evidence that degradation is being corrected. These implications concern the open-source tooling layer that we study; whether operators of hosted models behave similarly is an empirical question that public repositories cannot answer.</w:t>
       </w:r>
     </w:p>
     <w:p>
@@ -6325,7 +6520,20 @@
         <w:t xml:space="preserve">Monitoring obligations may need state triggers.</w:t>
       </w:r>
       <w:r>
-        <w:t xml:space="preserve"> Recent AI regulation, such as the post-market monitoring provisions of the European Union’s AI Act, requires providers of high-risk systems to monitor performance after deployment. Our results suggest that, without explicit triggers tied to measured performance, maintenance tends to follow user activity, accumulated work, or a calendar. Where degradation is a concern, obligations framed in terms of measured error rates or performance thresholds, rather than update schedules or release cadence, are more likely to produce state-dependent responses. Regulators and auditors may therefore wish to treat release frequency as uninformative about responsiveness </w:t>
+        <w:t xml:space="preserve"> Recent AI regulation, such as the post-market monitoring provisions of the European Union’s AI Act, requires providers of high-risk systems to monitor performance after deployment. Our results suggest that, without explicit triggers tied to measured performance, </w:t>
+      </w:r>
+      <w:del w:id="9159" w:author="Claude" w:date="2026-10-13T00:00:00Z">
+        <w:r>
+          <w:delText xml:space="preserve">maintenance tends to follow user activity, accumulated work, or a calendar</w:delText>
+        </w:r>
+      </w:del>
+      <w:ins w:id="9160" w:author="Claude" w:date="2026-10-13T00:00:00Z">
+        <w:r>
+          <w:t xml:space="preserve">maintenance tends to follow user activity, upstream launches, accumulated work, or a calendar</w:t>
+        </w:r>
+      </w:ins>
+      <w:r>
+        <w:t xml:space="preserve">. Where degradation is a concern, obligations framed in terms of measured error rates or performance thresholds, rather than update schedules or release cadence, are more likely to produce state-dependent responses. Regulators and auditors may therefore wish to treat release frequency as uninformative about responsiveness </w:t>
       </w:r>
       <w:del w:id="9033" w:author="Claude" w:date="2026-10-13T00:00:00Z">
         <w:r>
@@ -6490,6 +6698,26 @@
     <w:p>
       <w:pPr>
         <w:pStyle w:val="BodyText"/>
+        <w:rPr>
+          <w:ins w:id="9173" w:author="Claude" w:date="2026-10-13T00:00:00Z"/>
+        </w:rPr>
+      </w:pPr>
+      <w:ins w:id="9174" w:author="Claude" w:date="2026-10-13T00:00:00Z">
+        <w:r>
+          <w:rPr>
+            <w:b/>
+            <w:bCs/>
+          </w:rPr>
+          <w:t xml:space="preserve">Daily launch analysis.</w:t>
+        </w:r>
+        <w:r>
+          <w:t xml:space="preserve"> The daily analysis includes only repositories that had released in the preceding 90 days, which is why it uses 277 repository-launch pairs and not the 334 of the weekly analysis. The placebo test absorbs baseline differences in release rates between exposed and unexposed repositories, but not differences in how exposed repositories respond to any announcement. The coding of exposure is a judgment, the seven daily statistics are not independent, and the keyword patterns for matching models in release notes include generic terms that can match unrelated text.</w:t>
+        </w:r>
+      </w:ins>
+    </w:p>
+    <w:p>
+      <w:pPr>
+        <w:pStyle w:val="BodyText"/>
       </w:pPr>
       <w:r>
         <w:rPr>
@@ -6528,7 +6756,33 @@
         <w:pStyle w:val="FirstParagraph"/>
       </w:pPr>
       <w:r>
-        <w:t xml:space="preserve">We asked whether release timing in the open-source LLM ecosystem follows a state-dependent rule, in which accumulating degradation triggers a refresh, or a time-dependent rule, in which it does not. In 19 repositories, bug reports do not rise measurably with the age of a release relative to total issues, although a modest accumulation cannot be excluded once the post-release burst is absorbed. Release probabilities rise with the volume of user issues without a distinguishable extra response to bug reports, releases show no detectable response to upstream model launches, and the release hazard rises significantly with age in only one repository. The hazard does tend to rise with the stock of merged changes, although the data cannot cleanly separate that stock from calendar time. Release timing in this ecosystem therefore appears to follow user activity and accumulating work, and we </w:t>
+        <w:t xml:space="preserve">We asked whether release timing in the open-source LLM ecosystem follows a state-dependent rule, in which accumulating degradation triggers a refresh, or a time-dependent rule, in which it does not. In 19 repositories, bug reports do not rise measurably with the age of a release relative to total issues, although a modest accumulation cannot be excluded once the post-release burst is absorbed. Release probabilities rise with the volume of user issues without a distinguishable extra response to bug reports, </w:t>
+      </w:r>
+      <w:del w:id="9161" w:author="Claude" w:date="2026-10-13T00:00:00Z">
+        <w:r>
+          <w:delText xml:space="preserve">releases show no detectable response to upstream model launches, and the release hazard rises significantly</w:delText>
+        </w:r>
+      </w:del>
+      <w:ins w:id="9162" w:author="Claude" w:date="2026-10-13T00:00:00Z">
+        <w:r>
+          <w:t xml:space="preserve">releases respond to upstream model launches within days, and the release hazard rises significantly</w:t>
+        </w:r>
+      </w:ins>
+      <w:r>
+        <w:t xml:space="preserve"> with age in only one repository. The hazard does tend to rise with the stock of merged changes, although the data cannot cleanly separate that stock from calendar time. Release timing in this ecosystem therefore </w:t>
+      </w:r>
+      <w:del w:id="9163" w:author="Claude" w:date="2026-10-13T00:00:00Z">
+        <w:r>
+          <w:delText xml:space="preserve">appears to follow user activity and accumulating work</w:delText>
+        </w:r>
+      </w:del>
+      <w:ins w:id="9164" w:author="Claude" w:date="2026-10-13T00:00:00Z">
+        <w:r>
+          <w:t xml:space="preserve">appears to follow user activity, upstream launches, and accumulating work</w:t>
+        </w:r>
+      </w:ins>
+      <w:r>
+        <w:t xml:space="preserve">, and we </w:t>
       </w:r>
       <w:del w:id="9035" w:author="Claude" w:date="2026-10-13T00:00:00Z">
         <w:r>
@@ -6537,7 +6791,7 @@
       </w:del>
       <w:ins w:id="9036" w:author="Claude" w:date="2026-10-13T00:00:00Z">
         <w:r>
-          <w:t xml:space="preserve">cannot identify a response to accumulating errors beyond that. Release cadence thus says something about responsiveness to users, but it</w:t>
+          <w:t xml:space="preserve">cannot identify a response to accumulating errors beyond that. Release cadence thus says something about responsiveness to users and to upstream changes, but it</w:t>
         </w:r>
       </w:ins>
       <w:r>

</xml_diff>

<commit_message>
Designate restricted mean time as primary daily launch statistic (post hoc, disclosed)
Co-Authored-By: Claude Sonnet 5.5 <noreply@anthropic.com>
Claude-Session: https://claude.ai/code/session_017rpe9Z3CoCCyiANf2szbvW
</commit_message>
<xml_diff>
--- a/isr-revision/manuscript/Manuscript_ISR_Format_tracked.docx
+++ b/isr-revision/manuscript/Manuscript_ISR_Format_tracked.docx
@@ -308,7 +308,7 @@
       </w:del>
       <w:ins w:id="9148" w:author="Claude" w:date="2026-10-13T00:00:00Z">
         <w:r>
-          <w:t xml:space="preserve"> respond to 38 upstream model launches in the days after them. Exposed repositories are 17.5 percentage points more likely to release within one day of a launch than unexposed repositories (placebo-based p = 0.008), and the mean time to the next release is 3.4 days shorter (p = 0.02); the response is larger when controls exposed to other launches are excluded, and a weekly indicator misses it. Timing alone cannot show whether these releases address degradation or add support for the new model. </w:t>
+          <w:t xml:space="preserve"> respond to 38 upstream model launches in the days after them. The mean time to the next release is 3.4 days shorter for repositories exposed to a launch than for unexposed repositories (placebo-based p = 0.018), and the share that release within one day is 17.5 percentage points higher (p = 0.008); the response is larger when controls exposed to other launches are excluded, and a weekly indicator misses it. Timing alone cannot show whether these releases address degradation or add support for the new model. </w:t>
         </w:r>
       </w:ins>
     </w:p>
@@ -5531,7 +5531,7 @@
           <w:t xml:space="preserve">k</w:t>
         </w:r>
         <w:r>
-          <w:t xml:space="preserve"> = 0, 1, 3, 7, 14, 28), and the difference in the restricted mean time to the next release, truncated at 28 days. Both are averaged over launches with equal weight. Inference is by randomization: we replace each launch date with a placebo date drawn from days at least 14 days away from any real launch, keep the launch's type and therefore its exposed and unexposed sets, recompute the statistics, and repeat 999 times. The placebo distribution absorbs any baseline difference in release rates between exposed and unexposed repositories, and the p-value is the share of placebo statistics at least as far from the placebo mean as the observed statistic. To compare timing with content, we also record, for exposed repositories, the days until the first release whose notes mention the launched model, and whether that release is the first release after the launch. We also report a version in which controls that are exposed to another launch within the window are dropped.</w:t>
+          <w:t xml:space="preserve"> = 0, 1, 3, 7, 14, 28), and the difference in the restricted mean time to the next release, truncated at 28 days. Both are averaged over launches with equal weight. Inference is by randomization: we replace each launch date with a placebo date drawn from days at least 14 days away from any real launch, keep the launch's type and therefore its exposed and unexposed sets, recompute the statistics, and repeat 999 times. The placebo distribution absorbs any baseline difference in release rates between exposed and unexposed repositories, and the p-value is the share of placebo statistics at least as far from the placebo mean as the observed statistic. To compare timing with content, we also record, for exposed repositories, the days until the first release whose notes mention the launched model, and whether that release is the first release after the launch. We also report a version in which controls that are exposed to another launch within the window are dropped. The restricted mean time to the next release is our primary statistic, because it summarizes the first four weeks in one number and does not depend on a chosen horizon; we designated it after we had seen the estimates and not in advance.</w:t>
         </w:r>
       </w:ins>
     </w:p>
@@ -6053,7 +6053,7 @@
           <w:t xml:space="preserve">Daily resolution.</w:t>
         </w:r>
         <w:r>
-          <w:t xml:space="preserve"> Measured in days, exposed repositories release sooner after a launch than unexposed repositories do. Among the 277 repository-launch pairs in which the repository had released in the preceding 90 days, the share that release within one day of the announcement is 17.5 percentage points higher for exposed than for unexposed repositories, against 4.8 points on average at placebo launch dates (placebo 95 percent range −3.4 to 12.9; randomization p = 0.008). The differences are 11.2 points on the day of the launch (p = 0.03), 15.5 within three days (p = 0.04), 13.9 within 14 days (p = 0.03), and 7.0 within 28 days (p = 0.15), and the mean time to the next release, truncated at 28 days, is 3.4 days shorter (p = 0.02). The seven statistics are not independent, and a Bonferroni correction for seven comparisons raises the smallest p-value in this specification to 0.06. When controls that are exposed to another launch within the window are dropped, the differences are larger and last longer: 22.2 points within one day (p = 0.001), 21.2 within seven days (p = 0.01), 15.4 within 28 days (p = 0.009), and 5.9 days in the mean time to the next release (p = 0.001). The weekly estimates miss this response because a weekly indicator is close to saturation when the weekly release rate is 0.42, and client SDKs often release on the day a model is announced. Releases therefore do respond to a change in their environment, which is a form of state dependence. Timing alone cannot show whether a release shortly after a launch addresses degradation or adds support for the new model; the release notes below suggest that adding support is at least part of it.</w:t>
+          <w:t xml:space="preserve"> Measured in days, exposed repositories release sooner after a launch than unexposed repositories do. Among the 277 repository-launch pairs in which the repository had released in the preceding 90 days, the restricted mean time to the next release, truncated at 28 days, is 3.4 days shorter for exposed than for unexposed repositories, against 0.9 days shorter on average at placebo launch dates (placebo 95 percent range −3.0 to 1.2; randomization p = 0.018). Because the primary statistic was designated after we had seen the estimates, we regard the daily analysis as exploratory and report all seven statistics. The share that release within one day of the announcement is 17.5 percentage points higher for exposed repositories, against 4.8 points at placebo dates (range −3.4 to 12.9; p = 0.008). The differences are 11.2 points on the day of the launch (p = 0.03), 15.5 within three days (p = 0.04), 13.9 within 14 days (p = 0.03), and 7.0 within 28 days (p = 0.15). The statistics are not independent. When controls that are exposed to another launch within the window are dropped, the differences are larger and last longer: the mean time to the next release is 5.9 days shorter (p = 0.001), and the share that release is 22.2 points higher within one day (p = 0.001), 21.2 within seven days (p = 0.01), and 15.4 within 28 days (p = 0.009). The weekly estimates miss this response because a weekly indicator is close to saturation when the weekly release rate is 0.42, and client SDKs often release on the day a model is announced. Releases therefore do respond to a change in their environment, which is a form of state dependence. Timing alone cannot show whether a release shortly after a launch addresses degradation or adds support for the new model; the release notes below suggest that adding support is at least part of it.</w:t>
         </w:r>
       </w:ins>
     </w:p>
@@ -6711,7 +6711,7 @@
           <w:t xml:space="preserve">Daily launch analysis.</w:t>
         </w:r>
         <w:r>
-          <w:t xml:space="preserve"> The daily analysis includes only repositories that had released in the preceding 90 days, which is why it uses 277 repository-launch pairs and not the 334 of the weekly analysis. The placebo test absorbs baseline differences in release rates between exposed and unexposed repositories, but not differences in how exposed repositories respond to any announcement. The coding of exposure is a judgment, the seven daily statistics are not independent, and the keyword patterns for matching models in release notes include generic terms that can match unrelated text.</w:t>
+          <w:t xml:space="preserve"> The daily analysis includes only repositories that had released in the preceding 90 days, which is why it uses 277 repository-launch pairs and not the 334 of the weekly analysis. The placebo test absorbs baseline differences in release rates between exposed and unexposed repositories, but not differences in how exposed repositories respond to any announcement. The coding of exposure is a judgment, the seven daily statistics are not independent, the primary statistic was chosen after the estimates were seen, and the keyword patterns for matching models in release notes include generic terms that can match unrelated text.</w:t>
         </w:r>
       </w:ins>
     </w:p>

</xml_diff>

<commit_message>
Insert Figure 4 and reference in Section 5.4 (tracked)
Co-Authored-By: Claude Sonnet 5.5 <noreply@anthropic.com>
Claude-Session: https://claude.ai/code/session_017rpe9Z3CoCCyiANf2szbvW
</commit_message>
<xml_diff>
--- a/isr-revision/manuscript/Manuscript_ISR_Format_tracked.docx
+++ b/isr-revision/manuscript/Manuscript_ISR_Format_tracked.docx
@@ -6053,7 +6053,74 @@
           <w:t xml:space="preserve">Daily resolution.</w:t>
         </w:r>
         <w:r>
-          <w:t xml:space="preserve"> Measured in days, exposed repositories release sooner after a launch than unexposed repositories do. Among the 277 repository-launch pairs in which the repository had released in the preceding 90 days, the restricted mean time to the next release, truncated at 28 days, is 3.4 days shorter for exposed than for unexposed repositories, against 0.9 days shorter on average at placebo launch dates (placebo 95 percent range −3.0 to 1.2; randomization p = 0.018). Because the primary statistic was designated after we had seen the estimates, we regard the daily analysis as exploratory and report all seven statistics. The share that release within one day of the announcement is 17.5 percentage points higher for exposed repositories, against 4.8 points at placebo dates (range −3.4 to 12.9; p = 0.008). The differences are 11.2 points on the day of the launch (p = 0.03), 15.5 within three days (p = 0.04), 13.9 within 14 days (p = 0.03), and 7.0 within 28 days (p = 0.15). The statistics are not independent. When controls that are exposed to another launch within the window are dropped, the differences are larger and last longer: the mean time to the next release is 5.9 days shorter (p = 0.001), and the share that release is 22.2 points higher within one day (p = 0.001), 21.2 within seven days (p = 0.01), and 15.4 within 28 days (p = 0.009). The weekly estimates miss this response because a weekly indicator is close to saturation when the weekly release rate is 0.42, and client SDKs often release on the day a model is announced. Releases therefore do respond to a change in their environment, which is a form of state dependence. Timing alone cannot show whether a release shortly after a launch addresses degradation or adds support for the new model; the release notes below suggest that adding support is at least part of it.</w:t>
+          <w:t xml:space="preserve"> Measured in days, exposed repositories release sooner after a launch than unexposed repositories do. Among the 277 repository-launch pairs in which the repository had released in the preceding 90 days, the restricted mean time to the next release, truncated at 28 days, is 3.4 days shorter for exposed than for unexposed repositories, against 0.9 days shorter on average at placebo launch dates (placebo 95 percent range −3.0 to 1.2; randomization p = 0.018). Because the primary statistic was designated after we had seen the estimates, we regard the daily analysis as exploratory and report all seven statistics. The share that release within one day of the announcement is 17.5 percentage points higher for exposed repositories, against 4.8 points at placebo dates (range −3.4 to 12.9; p = 0.008). The differences are 11.2 points on the day of the launch (p = 0.03), 15.5 within three days (p = 0.04), 13.9 within 14 days (p = 0.03), and 7.0 within 28 days (p = 0.15). The statistics are not independent. Figure 4 plots the share that have released by each day: the observed gap lies above the placebo band in the first days after a launch and near its upper edge afterward. When controls that are exposed to another launch within the window are dropped, the differences are larger and last longer: the mean time to the next release is 5.9 days shorter (p = 0.001), and the share that release is 22.2 points higher within one day (p = 0.001), 21.2 within seven days (p = 0.01), and 15.4 within 28 days (p = 0.009). The weekly estimates miss this response because a weekly indicator is close to saturation when the weekly release rate is 0.42, and client SDKs often release on the day a model is announced. Releases therefore do respond to a change in their environment, which is a form of state dependence. Timing alone cannot show whether a release shortly after a launch addresses degradation or adds support for the new model; the release notes below suggest that adding support is at least part of it.</w:t>
+        </w:r>
+      </w:ins>
+    </w:p>
+    <w:p>
+      <w:pPr>
+        <w:keepNext/>
+        <w:pStyle w:val="BodyText"/>
+        <w:spacing w:before="120" w:after="60" w:line="240" w:lineRule="auto"/>
+        <w:ind w:firstLine="0"/>
+        <w:jc w:val="center"/>
+        <w:rPr>
+          <w:ins w:id="9173" w:author="Claude" w:date="2026-10-13T00:00:00Z"/>
+        </w:rPr>
+      </w:pPr>
+      <w:ins w:id="9174" w:author="Claude" w:date="2026-10-13T00:00:00Z">
+        <w:r>
+          <w:drawing>
+            <wp:inline xmlns:wp="http://schemas.openxmlformats.org/drawingml/2006/wordprocessingDrawing" distT="0" distB="0" distL="0" distR="0">
+              <wp:extent cx="5486400" cy="2743200"/>
+              <wp:docPr id="9004" name="Figure 4" descr="Figure 4"/>
+              <a:graphic xmlns:a="http://schemas.openxmlformats.org/drawingml/2006/main">
+                <a:graphicData uri="http://schemas.openxmlformats.org/drawingml/2006/picture">
+                  <pic:pic xmlns:pic="http://schemas.openxmlformats.org/drawingml/2006/picture">
+                    <pic:nvPicPr>
+                      <pic:cNvPr id="9004" name="fig4_launch_daily.png"/>
+                      <pic:cNvPicPr/>
+                    </pic:nvPicPr>
+                    <pic:blipFill>
+                      <a:blip xmlns:r="http://schemas.openxmlformats.org/officeDocument/2006/relationships" r:embed="rId9004"/>
+                      <a:stretch>
+                        <a:fillRect/>
+                      </a:stretch>
+                    </pic:blipFill>
+                    <pic:spPr>
+                      <a:xfrm>
+                        <a:off x="0" y="0"/>
+                        <a:ext cx="5486400" cy="2743200"/>
+                      </a:xfrm>
+                      <a:prstGeom prst="rect">
+                        <a:avLst/>
+                      </a:prstGeom>
+                    </pic:spPr>
+                  </pic:pic>
+                </a:graphicData>
+              </a:graphic>
+            </wp:inline>
+          </w:drawing>
+        </w:r>
+      </w:ins>
+    </w:p>
+    <w:p>
+      <w:pPr>
+        <w:pStyle w:val="BodyText"/>
+        <w:rPr>
+          <w:ins w:id="9175" w:author="Claude" w:date="2026-10-13T00:00:00Z"/>
+        </w:rPr>
+      </w:pPr>
+      <w:ins w:id="9176" w:author="Claude" w:date="2026-10-13T00:00:00Z">
+        <w:r>
+          <w:rPr>
+            <w:b/>
+            <w:bCs/>
+          </w:rPr>
+          <w:t xml:space="preserve">Figure 4.</w:t>
+        </w:r>
+        <w:r>
+          <w:t xml:space="preserve"> Difference between exposed and unexposed repositories in the share that have released by day k after an upstream launch (38 launches; 277 repository-launch pairs). The shaded band is the central 95 percent, pointwise, of the same statistic computed at placebo launch dates, and the dashed line is its mean. The primary statistic, the restricted mean time to the next release, is reported in the text.</w:t>
         </w:r>
       </w:ins>
     </w:p>
@@ -6699,10 +6766,10 @@
       <w:pPr>
         <w:pStyle w:val="BodyText"/>
         <w:rPr>
-          <w:ins w:id="9173" w:author="Claude" w:date="2026-10-13T00:00:00Z"/>
-        </w:rPr>
-      </w:pPr>
-      <w:ins w:id="9174" w:author="Claude" w:date="2026-10-13T00:00:00Z">
+          <w:ins w:id="9177" w:author="Claude" w:date="2026-10-13T00:00:00Z"/>
+        </w:rPr>
+      </w:pPr>
+      <w:ins w:id="9178" w:author="Claude" w:date="2026-10-13T00:00:00Z">
         <w:r>
           <w:rPr>
             <w:b/>

</xml_diff>

<commit_message>
Regenerate manuscript with final-panel 5.7 and hot-fix robustness in 5.4
Co-Authored-By: Claude Sonnet 5.5 <noreply@anthropic.com>
Claude-Session: https://claude.ai/code/session_017rpe9Z3CoCCyiANf2szbvW
</commit_message>
<xml_diff>
--- a/isr-revision/manuscript/Manuscript_ISR_Format_tracked.docx
+++ b/isr-revision/manuscript/Manuscript_ISR_Format_tracked.docx
@@ -308,7 +308,7 @@
       </w:del>
       <w:ins w:id="9148" w:author="Claude" w:date="2026-10-13T00:00:00Z">
         <w:r>
-          <w:t xml:space="preserve"> respond to 38 upstream model launches in the days after them. The mean time to the next release is 3.4 days shorter for repositories exposed to a launch than for unexposed repositories (placebo-based p = 0.018), and the share that release within one day is 17.5 percentage points higher (p = 0.008); the response is larger when controls exposed to other launches are excluded, and a weekly indicator misses it. Timing alone cannot show whether these releases address degradation or add support for the new model. </w:t>
+          <w:t xml:space="preserve"> respond to 38 upstream model launches in the days after them. The mean time to the next release is 3.4 days shorter for repositories exposed to a launch than for unexposed repositories (placebo-based p = 0.018), and the share that release within one day is 17.5 percentage points higher (p = 0.008); the response is larger when controls exposed to other launches are excluded, but it is concentrated in the first days and is smaller when hot-fixes are excluded (2.2 days; p = 0.10), and a weekly indicator misses it. Timing alone cannot show whether these releases address degradation or add support for the new model. </w:t>
         </w:r>
       </w:ins>
     </w:p>
@@ -6053,7 +6053,7 @@
           <w:t xml:space="preserve">Daily resolution.</w:t>
         </w:r>
         <w:r>
-          <w:t xml:space="preserve"> Measured in days, exposed repositories release sooner after a launch than unexposed repositories do. Among the 277 repository-launch pairs in which the repository had released in the preceding 90 days, the restricted mean time to the next release, truncated at 28 days, is 3.4 days shorter for exposed than for unexposed repositories, against 0.9 days shorter on average at placebo launch dates (placebo 95 percent range −3.0 to 1.2; randomization p = 0.018). Because the primary statistic was designated after we had seen the estimates, we regard the daily analysis as exploratory and report all seven statistics. The share that release within one day of the announcement is 17.5 percentage points higher for exposed repositories, against 4.8 points at placebo dates (range −3.4 to 12.9; p = 0.008). The differences are 11.2 points on the day of the launch (p = 0.03), 15.5 within three days (p = 0.04), 13.9 within 14 days (p = 0.03), and 7.0 within 28 days (p = 0.15). The statistics are not independent. Figure 4 plots the share that have released by each day: the observed gap lies above the placebo band in the first days after a launch and near its upper edge afterward. When controls that are exposed to another launch within the window are dropped, the differences are larger and last longer: the mean time to the next release is 5.9 days shorter (p = 0.001), and the share that release is 22.2 points higher within one day (p = 0.001), 21.2 within seven days (p = 0.01), and 15.4 within 28 days (p = 0.009). The weekly estimates miss this response because a weekly indicator is close to saturation when the weekly release rate is 0.42, and client SDKs often release on the day a model is announced. Releases therefore do respond to a change in their environment, which is a form of state dependence. Timing alone cannot show whether a release shortly after a launch addresses degradation or adds support for the new model; the release notes below suggest that adding support is at least part of it.</w:t>
+          <w:t xml:space="preserve"> Measured in days, exposed repositories release sooner after a launch than unexposed repositories do. Among the 277 repository-launch pairs in which the repository had released in the preceding 90 days, the restricted mean time to the next release, truncated at 28 days, is 3.4 days shorter for exposed than for unexposed repositories, against 0.9 days shorter on average at placebo launch dates (placebo 95 percent range −3.0 to 1.2; randomization p = 0.018). Because the primary statistic was designated after we had seen the estimates, we regard the daily analysis as exploratory and report all seven statistics. The share that release within one day of the announcement is 17.5 percentage points higher for exposed repositories, against 4.8 points at placebo dates (range −3.4 to 12.9; p = 0.008). The differences are 11.2 points on the day of the launch (p = 0.03), 15.5 within three days (p = 0.04), 13.9 within 14 days (p = 0.03), and 7.0 within 28 days (p = 0.15). The statistics are not independent. Figure 4 plots the share that have released by each day: the observed gap lies above the placebo band in the first days after a launch and near its upper edge afterward. When controls that are exposed to another launch within the window are dropped, the differences are larger and last longer: the mean time to the next release is 5.9 days shorter (p = 0.001), and the share that release is 22.2 points higher within one day (p = 0.001), 21.2 within seven days (p = 0.01), and 15.4 within 28 days (p = 0.009). When hot-fix releases are excluded and only regular releases count, the response is smaller and shorter: the mean time to the next release is 2.2 days shorter (p = 0.10), and the share that release is 7.4 points higher on the day of the launch (p = 0.02) and 10.9 points higher within one day (p = 0.006), but only 5.0 points higher within seven days (p = 0.63). Part of the response therefore consists of hot-fix releases, and the primary statistic is not significant at 5 percent once they are excluded. The weekly estimates miss this response because a weekly indicator is close to saturation when the weekly release rate is 0.42, and client SDKs often release on the day a model is announced. Releases therefore do respond to a change in their environment, which is a form of state dependence. Timing alone cannot show whether a release shortly after a launch addresses degradation or adds support for the new model; the release notes below suggest that adding support is at least part of it.</w:t>
         </w:r>
       </w:ins>
     </w:p>
@@ -6392,7 +6392,7 @@
       </w:pPr>
       <w:ins w:id="9134" w:author="Claude" w:date="2026-10-13T00:00:00Z">
         <w:r>
-          <w:t xml:space="preserve">We find no detectable response of adoption to release cadence. One standard deviation more releases in the trailing eight weeks is followed by a change of −0.008 in log download growth (clustered SE 0.034; wild cluster bootstrap p = 0.94) and of 0.047 in log star growth (SE 0.025; p = 0.10). The additional response to releases that follow a bug surge is −0.031 (p = 0.35) for downloads and −0.027 (p = 0.16) for stars, and that to hot-fixes is 0.020 (p = 0.63) and −0.020 (p = 0.66). In one of the six estimates of the response to releases, the star model that adds bug-preceded releases, the coefficient is 0.067 with a bootstrap p-value of 0.049; we do not read it as a finding, given the number of specifications we report and the estimate of 0.047 (p = 0.10) in the model without that term. With 16 clusters for downloads and 19 for stars, the minimum detectable effect at 80 percent power is about 0.09 and 0.07 log points per standard deviation, so the result does not show that receivers ignore cadence, only that adoption at weekly frequency does not reveal it. The argument of Section 2.4 then rests on the documented use of cadence in project-health assessments rather than on revealed behavior, and we say so in Section 6.3.</w:t>
+          <w:t xml:space="preserve">We find no detectable response of adoption to release cadence at the 5 percent level. One standard deviation more releases in the trailing eight weeks is followed by a change of −0.008 in log download growth (clustered SE 0.034; wild cluster bootstrap p = 0.94) and of 0.047 in log star growth (SE 0.025; p = 0.10). The additional response to releases that follow a bug surge is −0.026 (p = 0.50) for downloads and −0.022 (p = 0.24) for stars, and that to hot-fixes is 0.019 (p = 0.52) and −0.017 (p = 0.68). The estimates for stars are positive in all three models (0.047 to 0.064; p = 0.05 to 0.11), so a modest positive response of star growth cannot be excluded. With 16 clusters for downloads and 19 for stars, the minimum detectable effect at 80 percent power is about 0.09 and 0.07 log points per standard deviation, so the result does not show that receivers ignore cadence, only that adoption at weekly frequency does not reveal it. The argument of Section 2.4 then rests on the documented use of cadence in project-health assessments rather than on revealed behavior, and we say so in Section 6.3.</w:t>
         </w:r>
       </w:ins>
     </w:p>
@@ -6778,7 +6778,7 @@
           <w:t xml:space="preserve">Daily launch analysis.</w:t>
         </w:r>
         <w:r>
-          <w:t xml:space="preserve"> The daily analysis includes only repositories that had released in the preceding 90 days, which is why it uses 277 repository-launch pairs and not the 334 of the weekly analysis. The placebo test absorbs baseline differences in release rates between exposed and unexposed repositories, but not differences in how exposed repositories respond to any announcement. The coding of exposure is a judgment, the seven daily statistics are not independent, the primary statistic was chosen after the estimates were seen, and the keyword patterns for matching models in release notes include generic terms that can match unrelated text.</w:t>
+          <w:t xml:space="preserve"> The daily analysis includes only repositories that had released in the preceding 90 days, which is why it uses 277 repository-launch pairs and not the 334 of the weekly analysis. The placebo test absorbs baseline differences in release rates between exposed and unexposed repositories, but not differences in how exposed repositories respond to any announcement. The coding of exposure is a judgment, the seven daily statistics are not independent, the primary statistic was chosen after the estimates were seen and is not significant when hot-fixes are excluded, and the keyword patterns for matching models in release notes include generic terms that can match unrelated text.</w:t>
         </w:r>
       </w:ins>
     </w:p>

</xml_diff>

<commit_message>
Add clean-control + regular-release robustness to 5.4, intro and limitations
Co-Authored-By: Claude Sonnet 5.5 <noreply@anthropic.com>
Claude-Session: https://claude.ai/code/session_017rpe9Z3CoCCyiANf2szbvW
</commit_message>
<xml_diff>
--- a/isr-revision/manuscript/Manuscript_ISR_Format_tracked.docx
+++ b/isr-revision/manuscript/Manuscript_ISR_Format_tracked.docx
@@ -308,7 +308,7 @@
       </w:del>
       <w:ins w:id="9148" w:author="Claude" w:date="2026-10-13T00:00:00Z">
         <w:r>
-          <w:t xml:space="preserve"> respond to 38 upstream model launches in the days after them. The mean time to the next release is 3.4 days shorter for repositories exposed to a launch than for unexposed repositories (placebo-based p = 0.018), and the share that release within one day is 17.5 percentage points higher (p = 0.008); the response is larger when controls exposed to other launches are excluded, but it is concentrated in the first days and is smaller when hot-fixes are excluded (2.2 days; p = 0.10), and a weekly indicator misses it. Timing alone cannot show whether these releases address degradation or add support for the new model. </w:t>
+          <w:t xml:space="preserve"> respond to 38 upstream model launches in the days after them. The mean time to the next release is 3.4 days shorter for repositories exposed to a launch than for unexposed repositories (placebo-based p = 0.018), and the share that release within one day is 17.5 percentage points higher (p = 0.008); the response is larger when controls exposed to other launches are excluded, but it is concentrated in the first days and is smaller when hot-fixes are excluded (2.2 days; p = 0.10) unless controls exposed to other launches are also dropped (4.6 days; p = 0.002), and a weekly indicator misses it. Timing alone cannot show whether these releases address degradation or add support for the new model. </w:t>
         </w:r>
       </w:ins>
     </w:p>
@@ -6053,7 +6053,7 @@
           <w:t xml:space="preserve">Daily resolution.</w:t>
         </w:r>
         <w:r>
-          <w:t xml:space="preserve"> Measured in days, exposed repositories release sooner after a launch than unexposed repositories do. Among the 277 repository-launch pairs in which the repository had released in the preceding 90 days, the restricted mean time to the next release, truncated at 28 days, is 3.4 days shorter for exposed than for unexposed repositories, against 0.9 days shorter on average at placebo launch dates (placebo 95 percent range −3.0 to 1.2; randomization p = 0.018). Because the primary statistic was designated after we had seen the estimates, we regard the daily analysis as exploratory and report all seven statistics. The share that release within one day of the announcement is 17.5 percentage points higher for exposed repositories, against 4.8 points at placebo dates (range −3.4 to 12.9; p = 0.008). The differences are 11.2 points on the day of the launch (p = 0.03), 15.5 within three days (p = 0.04), 13.9 within 14 days (p = 0.03), and 7.0 within 28 days (p = 0.15). The statistics are not independent. Figure 4 plots the share that have released by each day: the observed gap lies above the placebo band in the first days after a launch and near its upper edge afterward. When controls that are exposed to another launch within the window are dropped, the differences are larger and last longer: the mean time to the next release is 5.9 days shorter (p = 0.001), and the share that release is 22.2 points higher within one day (p = 0.001), 21.2 within seven days (p = 0.01), and 15.4 within 28 days (p = 0.009). When hot-fix releases are excluded and only regular releases count, the response is smaller and shorter: the mean time to the next release is 2.2 days shorter (p = 0.10), and the share that release is 7.4 points higher on the day of the launch (p = 0.02) and 10.9 points higher within one day (p = 0.006), but only 5.0 points higher within seven days (p = 0.63). Part of the response therefore consists of hot-fix releases, and the primary statistic is not significant at 5 percent once they are excluded. The weekly estimates miss this response because a weekly indicator is close to saturation when the weekly release rate is 0.42, and client SDKs often release on the day a model is announced. Releases therefore do respond to a change in their environment, which is a form of state dependence. Timing alone cannot show whether a release shortly after a launch addresses degradation or adds support for the new model; the release notes below suggest that adding support is at least part of it.</w:t>
+          <w:t xml:space="preserve"> Measured in days, exposed repositories release sooner after a launch than unexposed repositories do. Among the 277 repository-launch pairs in which the repository had released in the preceding 90 days, the restricted mean time to the next release, truncated at 28 days, is 3.4 days shorter for exposed than for unexposed repositories, against 0.9 days shorter on average at placebo launch dates (placebo 95 percent range −3.0 to 1.2; randomization p = 0.018). Because the primary statistic was designated after we had seen the estimates, we regard the daily analysis as exploratory and report all seven statistics. The share that release within one day of the announcement is 17.5 percentage points higher for exposed repositories, against 4.8 points at placebo dates (range −3.4 to 12.9; p = 0.008). The differences are 11.2 points on the day of the launch (p = 0.03), 15.5 within three days (p = 0.04), 13.9 within 14 days (p = 0.03), and 7.0 within 28 days (p = 0.15). The statistics are not independent. Figure 4 plots the share that have released by each day: the observed gap lies above the placebo band in the first days after a launch and near its upper edge afterward. When controls that are exposed to another launch within the window are dropped, the differences are larger and last longer: the mean time to the next release is 5.9 days shorter (p = 0.001), and the share that release is 22.2 points higher within one day (p = 0.001), 21.2 within seven days (p = 0.01), and 15.4 within 28 days (p = 0.009). When hot-fix releases are excluded and only regular releases count, the response is smaller and shorter: the mean time to the next release is 2.2 days shorter (p = 0.10), and the share that release is 7.4 points higher on the day of the launch (p = 0.02) and 10.9 points higher within one day (p = 0.006), but only 5.0 points higher within seven days (p = 0.63). Part of the response therefore consists of hot-fix releases, and the primary statistic is not significant at 5 percent once they are excluded. When controls exposed to other launches are dropped as well, the response in regular releases is again clear: the mean time to the next release is 4.6 days shorter (p = 0.002), and the share that release is 14.4 points higher within one day (p = 0.002) and 14.7 points higher within 28 days (p = 0.007). The weekly estimates miss this response because a weekly indicator is close to saturation when the weekly release rate is 0.42, and client SDKs often release on the day a model is announced. Releases therefore do respond to a change in their environment, which is a form of state dependence. Timing alone cannot show whether a release shortly after a launch addresses degradation or adds support for the new model; the release notes below suggest that adding support is at least part of it.</w:t>
         </w:r>
       </w:ins>
     </w:p>
@@ -6778,7 +6778,7 @@
           <w:t xml:space="preserve">Daily launch analysis.</w:t>
         </w:r>
         <w:r>
-          <w:t xml:space="preserve"> The daily analysis includes only repositories that had released in the preceding 90 days, which is why it uses 277 repository-launch pairs and not the 334 of the weekly analysis. The placebo test absorbs baseline differences in release rates between exposed and unexposed repositories, but not differences in how exposed repositories respond to any announcement. The coding of exposure is a judgment, the seven daily statistics are not independent, the primary statistic was chosen after the estimates were seen and is not significant when hot-fixes are excluded, and the keyword patterns for matching models in release notes include generic terms that can match unrelated text.</w:t>
+          <w:t xml:space="preserve"> The daily analysis includes only repositories that had released in the preceding 90 days, which is why it uses 277 repository-launch pairs and not the 334 of the weekly analysis. The placebo test absorbs baseline differences in release rates between exposed and unexposed repositories, but not differences in how exposed repositories respond to any announcement. The coding of exposure is a judgment, the seven daily statistics are not independent, the primary statistic was chosen after the estimates were seen and is not significant when hot-fixes are excluded unless controls exposed to other launches are also dropped, and the keyword patterns for matching models in release notes include generic terms that can match unrelated text.</w:t>
         </w:r>
       </w:ins>
     </w:p>

</xml_diff>

<commit_message>
Add TensorRT-LLM/autogen download-exclusion robustness to 5.7 and 6.3
Co-Authored-By: Claude Sonnet 5.5 <noreply@anthropic.com>
Claude-Session: https://claude.ai/code/session_017rpe9Z3CoCCyiANf2szbvW
</commit_message>
<xml_diff>
--- a/isr-revision/manuscript/Manuscript_ISR_Format_tracked.docx
+++ b/isr-revision/manuscript/Manuscript_ISR_Format_tracked.docx
@@ -6392,7 +6392,7 @@
       </w:pPr>
       <w:ins w:id="9134" w:author="Claude" w:date="2026-10-13T00:00:00Z">
         <w:r>
-          <w:t xml:space="preserve">We find no detectable response of adoption to release cadence at the 5 percent level. One standard deviation more releases in the trailing eight weeks is followed by a change of −0.008 in log download growth (clustered SE 0.034; wild cluster bootstrap p = 0.94) and of 0.047 in log star growth (SE 0.025; p = 0.10). The additional response to releases that follow a bug surge is −0.026 (p = 0.50) for downloads and −0.022 (p = 0.24) for stars, and that to hot-fixes is 0.019 (p = 0.52) and −0.017 (p = 0.68). The estimates for stars are positive in all three models (0.047 to 0.064; p = 0.05 to 0.11), so a modest positive response of star growth cannot be excluded. With 16 clusters for downloads and 19 for stars, the minimum detectable effect at 80 percent power is about 0.09 and 0.07 log points per standard deviation, so the result does not show that receivers ignore cadence, only that adoption at weekly frequency does not reveal it. The argument of Section 2.4 then rests on the documented use of cadence in project-health assessments rather than on revealed behavior, and we say so in Section 6.3.</w:t>
+          <w:t xml:space="preserve">We find no detectable response of adoption to release cadence at the 5 percent level. One standard deviation more releases in the trailing eight weeks is followed by a change of −0.008 in log download growth (clustered SE 0.034; wild cluster bootstrap p = 0.94) and of 0.047 in log star growth (SE 0.025; p = 0.10). The additional response to releases that follow a bug surge is −0.026 (p = 0.50) for downloads and −0.022 (p = 0.24) for stars, and that to hot-fixes is 0.019 (p = 0.52) and −0.017 (p = 0.68). The estimates for stars are positive in all three models (0.047 to 0.064; p = 0.05 to 0.11), so a modest positive response of star growth cannot be excluded. Excluding the downloads of TensorRT-LLM, whose PyPI counts are incomplete, of autogen, whose PyPI packages are partly maintained by a fork, or of both leaves the download results unchanged (the response to releases is −0.005, −0.014, and −0.009; p = 0.91 or higher). With 16 clusters for downloads and 19 for stars, the minimum detectable effect at 80 percent power is about 0.09 and 0.07 log points per standard deviation, so the result does not show that receivers ignore cadence, only that adoption at weekly frequency does not reveal it. The argument of Section 2.4 then rests on the documented use of cadence in project-health assessments rather than on revealed behavior, and we say so in Section 6.3.</w:t>
         </w:r>
       </w:ins>
     </w:p>
@@ -6758,7 +6758,7 @@
           <w:t xml:space="preserve">Adoption measures.</w:t>
         </w:r>
         <w:r>
-          <w:t xml:space="preserve"> The receiver-side analysis uses downloads and stars as measures of adoption. Downloads include mirrors and continuous-integration installs, stars measure attention more than use, three repositories have no PyPI artifact, and the PyPI counts of TensorRT-LLM are incomplete because early versions were distributed through the NVIDIA package index. Adoption and releases are both driven by project momentum, which the lagged outcome and the issue control absorb only in part.</w:t>
+          <w:t xml:space="preserve"> The receiver-side analysis uses downloads and stars as measures of adoption. Downloads include mirrors and continuous-integration installs, stars measure attention more than use, three repositories have no PyPI artifact, and the PyPI counts of TensorRT-LLM are incomplete because early versions were distributed through the NVIDIA package index, and those of autogen combine two packages, one of which is now maintained by a fork. Excluding the downloads of either repository, or of both, leaves the estimates unchanged (Section 5.7). Adoption and releases are both driven by project momentum, which the lagged outcome and the issue control absorb only in part.</w:t>
         </w:r>
       </w:ins>
     </w:p>

</xml_diff>

<commit_message>
ISR format: consistent section numbering, figures in numerical order of first mention
Co-Authored-By: Claude Sonnet 5.5 <noreply@anthropic.com>
Claude-Session: https://claude.ai/code/session_017rpe9Z3CoCCyiANf2szbvW
</commit_message>
<xml_diff>
--- a/isr-revision/manuscript/Manuscript_ISR_Format_tracked.docx
+++ b/isr-revision/manuscript/Manuscript_ISR_Format_tracked.docx
@@ -25,12 +25,12 @@
       <w:r>
         <w:t xml:space="preserve">Organizations increasingly deploy systems built on large language models and are expected to refresh them as the world drifts away from their training data, yet little is known about what triggers a refresh. Release frequency is widely read as a signal of responsive maintenance. Drawing on signaling theory and on the distinction between state-dependent and time-dependent adjustment in price setting, we derive from a Poisson model of accumulating errors when cadence would be a valid signal, and test the implications on weekly issue, release, pull-request, and commit histories for 19 widely used open-source repositories in the LLM tooling ecosystem (3,432 repository-weeks; 2,456 releases). Bug reports show no measurable rise with the time since the last release relative to total issues, although a modest accumulation of up to about 3.9 percent per week cannot be excluded once the post-release burst of attention is absorbed. Release probabilities rise with the volume of user issues but show no significant additional response to bug reports at a given volume</w:t>
       </w:r>
-      <w:del w:id="9143" w:author="Claude" w:date="2026-10-13T00:00:00Z">
+      <w:del w:id="9145" w:author="Claude" w:date="2026-10-13T00:00:00Z">
         <w:r>
           <w:delText xml:space="preserve">, and no detectable response to 38 upstream model launches.</w:delText>
         </w:r>
       </w:del>
-      <w:ins w:id="9144" w:author="Claude" w:date="2026-10-13T00:00:00Z">
+      <w:ins w:id="9146" w:author="Claude" w:date="2026-10-13T00:00:00Z">
         <w:r>
           <w:t xml:space="preserve">. Repositories exposed to one of 38 upstream model launches release sooner in the days after it, a response that weekly data do not show.</w:t>
         </w:r>
@@ -72,9 +72,16 @@
         <w:pStyle w:val="Heading2"/>
         <w:pageBreakBefore/>
       </w:pPr>
-      <w:r>
-        <w:t xml:space="preserve">1 Introduction</w:t>
-      </w:r>
+      <w:del w:id="9139" w:author="Claude" w:date="2026-10-13T00:00:00Z">
+        <w:r>
+          <w:delText xml:space="preserve">1 Introduction</w:delText>
+        </w:r>
+      </w:del>
+      <w:ins w:id="9140" w:author="Claude" w:date="2026-10-13T00:00:00Z">
+        <w:r>
+          <w:t xml:space="preserve">1. Introduction</w:t>
+        </w:r>
+      </w:ins>
     </w:p>
     <w:p>
       <w:pPr>
@@ -114,12 +121,12 @@
           <w:t xml:space="preserve">user issues, but a response to bug reports cannot be distinguished from a response to overall issue volume</w:t>
         </w:r>
       </w:ins>
-      <w:del w:id="9145" w:author="Claude" w:date="2026-10-13T00:00:00Z">
+      <w:del w:id="9147" w:author="Claude" w:date="2026-10-13T00:00:00Z">
         <w:r>
           <w:delText xml:space="preserve">, and they show no detectable response to upstream model launches.</w:delText>
         </w:r>
       </w:del>
-      <w:ins w:id="9146" w:author="Claude" w:date="2026-10-13T00:00:00Z">
+      <w:ins w:id="9148" w:author="Claude" w:date="2026-10-13T00:00:00Z">
         <w:r>
           <w:t xml:space="preserve">, and they respond within days to upstream model launches.</w:t>
         </w:r>
@@ -301,12 +308,12 @@
           <w:t xml:space="preserve">Because bug reports are part of total issues, this last comparison is conservative, and its interval does not exclude a sizable additional response. Releases</w:t>
         </w:r>
       </w:ins>
-      <w:del w:id="9147" w:author="Claude" w:date="2026-10-13T00:00:00Z">
+      <w:del w:id="9149" w:author="Claude" w:date="2026-10-13T00:00:00Z">
         <w:r>
           <w:delText xml:space="preserve"> show no detectable response to 38 upstream model launches, although release notes often mention a new model after its launch, which suggests that the content of releases responds while their timing does not. </w:delText>
         </w:r>
       </w:del>
-      <w:ins w:id="9148" w:author="Claude" w:date="2026-10-13T00:00:00Z">
+      <w:ins w:id="9150" w:author="Claude" w:date="2026-10-13T00:00:00Z">
         <w:r>
           <w:t xml:space="preserve"> respond to 38 upstream model launches in the days after them. The mean time to the next release is 3.4 days shorter for repositories exposed to a launch than for unexposed repositories (placebo-based p = 0.018), and the share that release within one day is 17.5 percentage points higher (p = 0.008); the response is larger when controls exposed to other launches are excluded, but it is concentrated in the first days and is smaller when hot-fixes are excluded (2.2 days; p = 0.10) unless controls exposed to other launches are also dropped (4.6 days; p = 0.002), and a weekly indicator misses it. Timing alone cannot show whether these releases address degradation or add support for the new model. </w:t>
         </w:r>
@@ -342,12 +349,12 @@
           <w:t xml:space="preserve">user issues without a response to bug reports that can be distinguished from a response to overall volume, that their timing responds</w:t>
         </w:r>
       </w:ins>
-      <w:del w:id="9149" w:author="Claude" w:date="2026-10-13T00:00:00Z">
+      <w:del w:id="9151" w:author="Claude" w:date="2026-10-13T00:00:00Z">
         <w:r>
           <w:delText xml:space="preserve"> to upstream launches, and that they tend to follow</w:delText>
         </w:r>
       </w:del>
-      <w:ins w:id="9150" w:author="Claude" w:date="2026-10-13T00:00:00Z">
+      <w:ins w:id="9152" w:author="Claude" w:date="2026-10-13T00:00:00Z">
         <w:r>
           <w:t xml:space="preserve"> to upstream launches within days but not in weekly data, and that they tend to follow</w:t>
         </w:r>
@@ -5499,10 +5506,10 @@
       <w:pPr>
         <w:pStyle w:val="BodyText"/>
         <w:rPr>
-          <w:ins w:id="9169" w:author="Claude" w:date="2026-10-13T00:00:00Z"/>
-        </w:rPr>
-      </w:pPr>
-      <w:ins w:id="9170" w:author="Claude" w:date="2026-10-13T00:00:00Z">
+          <w:ins w:id="9171" w:author="Claude" w:date="2026-10-13T00:00:00Z"/>
+        </w:rPr>
+      </w:pPr>
+      <w:ins w:id="9172" w:author="Claude" w:date="2026-10-13T00:00:00Z">
         <w:r>
           <w:rPr>
             <w:b/>
@@ -5987,6 +5994,73 @@
     </w:p>
     <w:p>
       <w:pPr>
+        <w:keepNext/>
+        <w:pStyle w:val="BodyText"/>
+        <w:spacing w:before="120" w:after="60" w:line="240" w:lineRule="auto"/>
+        <w:ind w:firstLine="0"/>
+        <w:jc w:val="center"/>
+        <w:rPr>
+          <w:ins w:id="9125" w:author="Claude" w:date="2026-10-13T00:00:00Z"/>
+        </w:rPr>
+      </w:pPr>
+      <w:ins w:id="9126" w:author="Claude" w:date="2026-10-13T00:00:00Z">
+        <w:r>
+          <w:drawing>
+            <wp:inline xmlns:wp="http://schemas.openxmlformats.org/drawingml/2006/wordprocessingDrawing" distT="0" distB="0" distL="0" distR="0">
+              <wp:extent cx="5486400" cy="2209800"/>
+              <wp:docPr id="9003" name="Figure 3" descr="Figure 3"/>
+              <a:graphic xmlns:a="http://schemas.openxmlformats.org/drawingml/2006/main">
+                <a:graphicData uri="http://schemas.openxmlformats.org/drawingml/2006/picture">
+                  <pic:pic xmlns:pic="http://schemas.openxmlformats.org/drawingml/2006/picture">
+                    <pic:nvPicPr>
+                      <pic:cNvPr id="9003" name="fig3_rq3_rq4_coefficients.png"/>
+                      <pic:cNvPicPr/>
+                    </pic:nvPicPr>
+                    <pic:blipFill>
+                      <a:blip xmlns:r="http://schemas.openxmlformats.org/officeDocument/2006/relationships" r:embed="rId9003"/>
+                      <a:stretch>
+                        <a:fillRect/>
+                      </a:stretch>
+                    </pic:blipFill>
+                    <pic:spPr>
+                      <a:xfrm>
+                        <a:off x="0" y="0"/>
+                        <a:ext cx="5486400" cy="2209800"/>
+                      </a:xfrm>
+                      <a:prstGeom prst="rect">
+                        <a:avLst/>
+                      </a:prstGeom>
+                    </pic:spPr>
+                  </pic:pic>
+                </a:graphicData>
+              </a:graphic>
+            </wp:inline>
+          </w:drawing>
+        </w:r>
+      </w:ins>
+    </w:p>
+    <w:p>
+      <w:pPr>
+        <w:pStyle w:val="BodyText"/>
+        <w:rPr>
+          <w:ins w:id="9127" w:author="Claude" w:date="2026-10-13T00:00:00Z"/>
+        </w:rPr>
+      </w:pPr>
+      <w:ins w:id="9128" w:author="Claude" w:date="2026-10-13T00:00:00Z">
+        <w:r>
+          <w:rPr>
+            <w:b/>
+            <w:bCs/>
+          </w:rPr>
+          <w:t xml:space="preserve">Figure 3.</w:t>
+        </w:r>
+        <w:r>
+          <w:t xml:space="preserve"> (a) Response of the release hazard to issues in the previous week, holding non-bug issues or total issues fixed (Section 5.3). (b) Pooled coefficients on work age and calendar age in the regular-release hazard, entered alone and jointly (Section 5.5).</w:t>
+        </w:r>
+      </w:ins>
+    </w:p>
+    <w:p>
+      <w:pPr>
         <w:pStyle w:val="FirstParagraph"/>
       </w:pPr>
       <w:r>
@@ -6018,12 +6092,12 @@
       <w:pPr>
         <w:pStyle w:val="Heading3"/>
       </w:pPr>
-      <w:del w:id="9139" w:author="Claude" w:date="2026-10-13T00:00:00Z">
+      <w:del w:id="9141" w:author="Claude" w:date="2026-10-13T00:00:00Z">
         <w:r>
           <w:delText xml:space="preserve">5.4. RQ3: No Detectable Release Response to Upstream Model Launches</w:delText>
         </w:r>
       </w:del>
-      <w:ins w:id="9140" w:author="Claude" w:date="2026-10-13T00:00:00Z">
+      <w:ins w:id="9142" w:author="Claude" w:date="2026-10-13T00:00:00Z">
         <w:r>
           <w:t xml:space="preserve">5.4. RQ3: A Short-Run Release Response to Upstream Model Launches</w:t>
         </w:r>
@@ -6041,10 +6115,10 @@
       <w:pPr>
         <w:pStyle w:val="BodyText"/>
         <w:rPr>
-          <w:ins w:id="9171" w:author="Claude" w:date="2026-10-13T00:00:00Z"/>
-        </w:rPr>
-      </w:pPr>
-      <w:ins w:id="9172" w:author="Claude" w:date="2026-10-13T00:00:00Z">
+          <w:ins w:id="9173" w:author="Claude" w:date="2026-10-13T00:00:00Z"/>
+        </w:rPr>
+      </w:pPr>
+      <w:ins w:id="9174" w:author="Claude" w:date="2026-10-13T00:00:00Z">
         <w:r>
           <w:rPr>
             <w:b/>
@@ -6065,10 +6139,10 @@
         <w:ind w:firstLine="0"/>
         <w:jc w:val="center"/>
         <w:rPr>
-          <w:ins w:id="9173" w:author="Claude" w:date="2026-10-13T00:00:00Z"/>
-        </w:rPr>
-      </w:pPr>
-      <w:ins w:id="9174" w:author="Claude" w:date="2026-10-13T00:00:00Z">
+          <w:ins w:id="9175" w:author="Claude" w:date="2026-10-13T00:00:00Z"/>
+        </w:rPr>
+      </w:pPr>
+      <w:ins w:id="9176" w:author="Claude" w:date="2026-10-13T00:00:00Z">
         <w:r>
           <w:drawing>
             <wp:inline xmlns:wp="http://schemas.openxmlformats.org/drawingml/2006/wordprocessingDrawing" distT="0" distB="0" distL="0" distR="0">
@@ -6108,10 +6182,10 @@
       <w:pPr>
         <w:pStyle w:val="BodyText"/>
         <w:rPr>
-          <w:ins w:id="9175" w:author="Claude" w:date="2026-10-13T00:00:00Z"/>
-        </w:rPr>
-      </w:pPr>
-      <w:ins w:id="9176" w:author="Claude" w:date="2026-10-13T00:00:00Z">
+          <w:ins w:id="9177" w:author="Claude" w:date="2026-10-13T00:00:00Z"/>
+        </w:rPr>
+      </w:pPr>
+      <w:ins w:id="9178" w:author="Claude" w:date="2026-10-13T00:00:00Z">
         <w:r>
           <w:rPr>
             <w:b/>
@@ -6131,12 +6205,12 @@
       <w:r>
         <w:t xml:space="preserve">Release notes do mention new models. In exposed repositories, 143 of 334 repository-launch pairs (42.8 percent) have at least one release within eight weeks after the launch that mentions the launched model; the median delay is 10 days (interquartile range 1 to 24); and 287 of 1,901 releases after launch mention it, against 26 of 1,871 releases before. The match is by keyword and we have not validated it by hand, so some matches may be false positives. </w:t>
       </w:r>
-      <w:del w:id="9141" w:author="Claude" w:date="2026-10-13T00:00:00Z">
+      <w:del w:id="9143" w:author="Claude" w:date="2026-10-13T00:00:00Z">
         <w:r>
           <w:delText xml:space="preserve">If most are correct, the pattern is consistent with the content of releases responding to a launch while their timing does not: support for a new model is shipped in releases that would probably have appeared anyway. H4 is not supported by the upstream signal either.</w:delText>
         </w:r>
       </w:del>
-      <w:ins w:id="9142" w:author="Claude" w:date="2026-10-13T00:00:00Z">
+      <w:ins w:id="9144" w:author="Claude" w:date="2026-10-13T00:00:00Z">
         <w:r>
           <w:t xml:space="preserve">If most are correct, the pattern is consistent with releases being brought forward to ship support for a new model. H4 is supported by the upstream signal at daily resolution but not at weekly resolution, and the response is better read as one to a change in the environment than as a response to degradation in the sense of Section 3.</w:t>
         </w:r>
@@ -6205,73 +6279,6 @@
     </w:p>
     <w:p>
       <w:pPr>
-        <w:keepNext/>
-        <w:pStyle w:val="BodyText"/>
-        <w:spacing w:before="120" w:after="60" w:line="240" w:lineRule="auto"/>
-        <w:ind w:firstLine="0"/>
-        <w:jc w:val="center"/>
-        <w:rPr>
-          <w:ins w:id="9125" w:author="Claude" w:date="2026-10-13T00:00:00Z"/>
-        </w:rPr>
-      </w:pPr>
-      <w:ins w:id="9126" w:author="Claude" w:date="2026-10-13T00:00:00Z">
-        <w:r>
-          <w:drawing>
-            <wp:inline xmlns:wp="http://schemas.openxmlformats.org/drawingml/2006/wordprocessingDrawing" distT="0" distB="0" distL="0" distR="0">
-              <wp:extent cx="5486400" cy="2209800"/>
-              <wp:docPr id="9003" name="Figure 3" descr="Figure 3"/>
-              <a:graphic xmlns:a="http://schemas.openxmlformats.org/drawingml/2006/main">
-                <a:graphicData uri="http://schemas.openxmlformats.org/drawingml/2006/picture">
-                  <pic:pic xmlns:pic="http://schemas.openxmlformats.org/drawingml/2006/picture">
-                    <pic:nvPicPr>
-                      <pic:cNvPr id="9003" name="fig3_rq3_rq4_coefficients.png"/>
-                      <pic:cNvPicPr/>
-                    </pic:nvPicPr>
-                    <pic:blipFill>
-                      <a:blip xmlns:r="http://schemas.openxmlformats.org/officeDocument/2006/relationships" r:embed="rId9003"/>
-                      <a:stretch>
-                        <a:fillRect/>
-                      </a:stretch>
-                    </pic:blipFill>
-                    <pic:spPr>
-                      <a:xfrm>
-                        <a:off x="0" y="0"/>
-                        <a:ext cx="5486400" cy="2209800"/>
-                      </a:xfrm>
-                      <a:prstGeom prst="rect">
-                        <a:avLst/>
-                      </a:prstGeom>
-                    </pic:spPr>
-                  </pic:pic>
-                </a:graphicData>
-              </a:graphic>
-            </wp:inline>
-          </w:drawing>
-        </w:r>
-      </w:ins>
-    </w:p>
-    <w:p>
-      <w:pPr>
-        <w:pStyle w:val="BodyText"/>
-        <w:rPr>
-          <w:ins w:id="9127" w:author="Claude" w:date="2026-10-13T00:00:00Z"/>
-        </w:rPr>
-      </w:pPr>
-      <w:ins w:id="9128" w:author="Claude" w:date="2026-10-13T00:00:00Z">
-        <w:r>
-          <w:rPr>
-            <w:b/>
-            <w:bCs/>
-          </w:rPr>
-          <w:t xml:space="preserve">Figure 3.</w:t>
-        </w:r>
-        <w:r>
-          <w:t xml:space="preserve"> (a) Response of the release hazard to issues in the previous week, holding non-bug issues or total issues fixed (Section 5.3). (b) Pooled coefficients on work age and calendar age in the regular-release hazard, entered alone and jointly (Section 5.5).</w:t>
-        </w:r>
-      </w:ins>
-    </w:p>
-    <w:p>
-      <w:pPr>
         <w:pStyle w:val="FirstParagraph"/>
       </w:pPr>
       <w:r>
@@ -6328,171 +6335,171 @@
       <w:r>
         <w:t xml:space="preserve">For the age slope of bug reports under specification (b), the pooled estimate (−0.003, SE 0.006) is statistically equivalent to zero within ±0.02 log points per week (TOST p = 0.004). Equivalence would hold for any bound above 0.013, and the minimum effect detectable with 80 percent power is 0.018. Under specification (d) equivalence at that bound is not established (estimate 0.017, SE 0.010; TOST p = 0.40; equivalence for any bound above 0.035; minimum detectable effect 0.029). </w:t>
       </w:r>
+      <w:del w:id="9169" w:author="Claude" w:date="2026-10-13T00:00:00Z">
+        <w:r>
+          <w:delText xml:space="preserve">For the launch event study the estimate</w:delText>
+        </w:r>
+      </w:del>
+      <w:ins w:id="9170" w:author="Claude" w:date="2026-10-13T00:00:00Z">
+        <w:r>
+          <w:t xml:space="preserve">For the weekly launch event study the estimate</w:t>
+        </w:r>
+      </w:ins>
+      <w:r>
+        <w:t xml:space="preserve"> (−0.002, SE 0.018) is equivalent to zero within ±5 percentage points (TOST p = 0.004; smallest bound 0.032; minimum detectable effect 0.050). For the one-week response to bug reports, equivalence within ±0.25 log-odds per standard deviation is not established, with total issues held fixed (estimate 0.191, SE 0.123; TOST p = 0.32; smallest bound 0.39) or with non-bug issues held fixed (0.261, SE 0.095; TOST p = 0.55; smallest bound 0.42), as expected when the estimates are themselves positive. The bounds are anchored to the data, which is why the smallest bound for equivalence is reported as well.</w:t>
+      </w:r>
+    </w:p>
+    <w:p>
+      <w:pPr>
+        <w:pStyle w:val="BodyText"/>
+      </w:pPr>
+      <w:r>
+        <w:rPr>
+          <w:b/>
+          <w:bCs/>
+        </w:rPr>
+        <w:t xml:space="preserve">Heterogeneity. </w:t>
+      </w:r>
+      <w:r>
+        <w:t xml:space="preserve">Excluding the two repositories that may rely on automated release pipelines (anthropic-sdk-python and openai-python) leaves the conclusions unchanged. The pooled age slope is −0.003 under specification (b) (95% CI −0.015 to 0.010) and +0.019 under (d) (−0.007 to 0.044), and the coefficient on bug reports with non-bug issues held fixed rises to 0.304 (SE 0.093). </w:t>
+      </w:r>
+      <w:del w:id="9106" w:author="Claude" w:date="2026-10-13T00:00:00Z">
+        <w:r>
+          <w:delText xml:space="preserve">The thirteen slower releasers give 0.000 under (b) (−0.009 to 0.009), +0.015 under (d) (−0.006 to 0.034), and 0.211 (SE 0.082) for the response to bug reports. For the six weekly releasers (a median gap of at most one week between release weeks among all collected releases; Table 1 lists seven repositories with a median cycle of one week) the (b) estimate is imprecise (−0.033; −0.104 to 0.038), and the (d) estimate (0.248; 0.077 to 0.418) rests on few observations beyond the third week after a release and is not reliable.</w:delText>
+        </w:r>
+      </w:del>
+      <w:ins w:id="9107" w:author="Claude" w:date="2026-10-13T00:00:00Z">
+        <w:r>
+          <w:t xml:space="preserve">The twelve other repositories give 0.000 under (b) (−0.009 to 0.010), +0.014 under (d) (−0.005 to 0.033), and 0.158 (SE 0.097) for the response to bug reports. For the seven weekly releasers (Table 1) the estimates are imprecise: −0.021 (−0.072 to 0.031) under (b), +0.087 (−0.150 to 0.324) under (d), and 0.341 (SE 0.182) for the response to bug reports. The (d) estimate rests on few observations beyond the third week after a release and should be read with caution.</w:t>
+        </w:r>
+      </w:ins>
+      <w:r>
+        <w:t xml:space="preserve"> Within categories of three repositories the estimates are too imprecise to interpret; agent frameworks show a response to bug reports of 0.709 (SE 0.134) and inference engines an age slope under (d) of 0.045 (0.002 to 0.087), which we treat as exploratory.</w:t>
+      </w:r>
+    </w:p>
+    <w:p>
+      <w:pPr>
+        <w:pStyle w:val="Heading3"/>
+        <w:rPr>
+          <w:ins w:id="9131" w:author="Claude" w:date="2026-10-13T00:00:00Z"/>
+        </w:rPr>
+      </w:pPr>
+      <w:ins w:id="9132" w:author="Claude" w:date="2026-10-13T00:00:00Z">
+        <w:r>
+          <w:t xml:space="preserve">5.7. Receivers: Does Adoption Respond to Cadence?</w:t>
+        </w:r>
+      </w:ins>
+    </w:p>
+    <w:p>
+      <w:pPr>
+        <w:pStyle w:val="FirstParagraph"/>
+        <w:rPr>
+          <w:ins w:id="9133" w:author="Claude" w:date="2026-10-13T00:00:00Z"/>
+        </w:rPr>
+      </w:pPr>
+      <w:ins w:id="9134" w:author="Claude" w:date="2026-10-13T00:00:00Z">
+        <w:r>
+          <w:t xml:space="preserve">We find no detectable response of adoption to release cadence at the 5 percent level. One standard deviation more releases in the trailing eight weeks is followed by a change of −0.008 in log download growth (clustered SE 0.034; wild cluster bootstrap p = 0.94) and of 0.047 in log star growth (SE 0.025; p = 0.10). The additional response to releases that follow a bug surge is −0.026 (p = 0.50) for downloads and −0.022 (p = 0.24) for stars, and that to hot-fixes is 0.019 (p = 0.52) and −0.017 (p = 0.68). The estimates for stars are positive in all three models (0.047 to 0.064; p = 0.05 to 0.11), so a modest positive response of star growth cannot be excluded. Excluding the downloads of TensorRT-LLM, whose PyPI counts are incomplete, of autogen, whose PyPI packages are partly maintained by a fork, or of both leaves the download results unchanged (the response to releases is −0.005, −0.014, and −0.009; p = 0.91 or higher). With 16 clusters for downloads and 19 for stars, the minimum detectable effect at 80 percent power is about 0.09 and 0.07 log points per standard deviation, so the result does not show that receivers ignore cadence, only that adoption at weekly frequency does not reveal it. The argument of Section 2.4 then rests on the documented use of cadence in project-health assessments rather than on revealed behavior, and we say so in Section 6.3.</w:t>
+        </w:r>
+      </w:ins>
+    </w:p>
+    <w:p>
+      <w:pPr>
+        <w:pStyle w:val="Heading2"/>
+      </w:pPr>
+      <w:r>
+        <w:t xml:space="preserve">6. Discussion</w:t>
+      </w:r>
+    </w:p>
+    <w:p>
+      <w:pPr>
+        <w:pStyle w:val="Heading3"/>
+      </w:pPr>
+      <w:r>
+        <w:t xml:space="preserve">6.1. Interpretation</w:t>
+      </w:r>
+    </w:p>
+    <w:p>
+      <w:pPr>
+        <w:pStyle w:val="FirstParagraph"/>
+      </w:pPr>
+      <w:r>
+        <w:t xml:space="preserve">Releases in these repositories </w:t>
+      </w:r>
+      <w:del w:id="9153" w:author="Claude" w:date="2026-10-13T00:00:00Z">
+        <w:r>
+          <w:delText xml:space="preserve">respond to the volume of user activity and, more weakly, to accumulated work</w:delText>
+        </w:r>
+      </w:del>
+      <w:ins w:id="9154" w:author="Claude" w:date="2026-10-13T00:00:00Z">
+        <w:r>
+          <w:t xml:space="preserve">respond to the volume of user activity, to upstream model launches, and, more weakly, to accumulated work</w:t>
+        </w:r>
+      </w:ins>
+      <w:r>
+        <w:t xml:space="preserve">, but we find no clear relationship with an accumulating error state. Bug reports do not rise measurably with the age of a release relative to total issues, although a modest accumulation cannot be excluded once the post-release burst is absorbed. Release probabilities rise with the volume of user issues without a distinguishable extra response to bug reports, </w:t>
+      </w:r>
+      <w:del w:id="9155" w:author="Claude" w:date="2026-10-13T00:00:00Z">
+        <w:r>
+          <w:delText xml:space="preserve">releases show no detectable response to upstream model launches, and the release hazard tends to rise</w:delText>
+        </w:r>
+      </w:del>
+      <w:ins w:id="9156" w:author="Claude" w:date="2026-10-13T00:00:00Z">
+        <w:r>
+          <w:t xml:space="preserve">releases respond to upstream model launches within days, and the release hazard tends to rise</w:t>
+        </w:r>
+      </w:ins>
+      <w:r>
+        <w:t xml:space="preserve"> with the stock of merged changes. These findings suggest that the observable timing of maintenance need not form a feedback loop with system deterioration. This qualifies models that treat maintenance as a responsive, state-dependent control process: such models are valid only when an accumulating error state exists and maintainers respond to it, conditions that are not clearly met in these data. The evidence is consistent with release activity in this ecosystem </w:t>
+      </w:r>
+      <w:del w:id="9157" w:author="Claude" w:date="2026-10-13T00:00:00Z">
+        <w:r>
+          <w:delText xml:space="preserve">mainly reflecting user activity and the accumulation of development work</w:delText>
+        </w:r>
+      </w:del>
+      <w:ins w:id="9158" w:author="Claude" w:date="2026-10-13T00:00:00Z">
+        <w:r>
+          <w:t xml:space="preserve">mainly reflecting user activity, upstream launches, and the accumulation of development work</w:t>
+        </w:r>
+      </w:ins>
+      <w:r>
+        <w:t xml:space="preserve">. This distinction has implications for how information systems researchers conceptualize monitoring, feedback, and control in AI-enabled systems. In particular, treating release cadence as a validated signal of responsiveness </w:t>
+      </w:r>
+      <w:del w:id="9027" w:author="Claude" w:date="2026-10-13T00:00:00Z">
+        <w:r>
+          <w:delText xml:space="preserve">conflates development activity with a control response to degradation</w:delText>
+        </w:r>
+      </w:del>
+      <w:ins w:id="9028" w:author="Claude" w:date="2026-10-13T00:00:00Z">
+        <w:r>
+          <w:t xml:space="preserve">to degradation conflates responsiveness to users, to upstream launches, and to development work with a control response to deterioration</w:t>
+        </w:r>
+      </w:ins>
+      <w:r>
+        <w:t xml:space="preserve">. </w:t>
+      </w:r>
+    </w:p>
+    <w:p>
+      <w:pPr>
+        <w:pStyle w:val="FirstParagraph"/>
+      </w:pPr>
+      <w:r>
+        <w:t xml:space="preserve">The repositories therefore resemble firms whose adjustment responds to observable demand and to an accumulating stock of work, as in Sheshinski and Weiss (1977), but the state to which they respond is not clearly accumulated errors. A calendar cadence, as in Taylor (1980), cannot be excluded, because work and calendar time are correlated. Because bug reports build up at most modestly, these data cannot distinguish a maintainer who ignores an accumulating error state from one who has little to respond to. Both readings carry the same practical message. </w:t>
+      </w:r>
+    </w:p>
+    <w:p>
+      <w:pPr>
+        <w:pStyle w:val="FirstParagraph"/>
+      </w:pPr>
+      <w:r>
+        <w:t xml:space="preserve">In this ecosystem, we find no evidence that release timing is a mechanism through which degradation, if it occurs, would be corrected, </w:t>
+      </w:r>
       <w:del w:id="9167" w:author="Claude" w:date="2026-10-13T00:00:00Z">
         <w:r>
-          <w:delText xml:space="preserve">For the launch event study the estimate</w:delText>
+          <w:delText xml:space="preserve">although releases do respond to the flow of user reports.</w:delText>
         </w:r>
       </w:del>
       <w:ins w:id="9168" w:author="Claude" w:date="2026-10-13T00:00:00Z">
-        <w:r>
-          <w:t xml:space="preserve">For the weekly launch event study the estimate</w:t>
-        </w:r>
-      </w:ins>
-      <w:r>
-        <w:t xml:space="preserve"> (−0.002, SE 0.018) is equivalent to zero within ±5 percentage points (TOST p = 0.004; smallest bound 0.032; minimum detectable effect 0.050). For the one-week response to bug reports, equivalence within ±0.25 log-odds per standard deviation is not established, with total issues held fixed (estimate 0.191, SE 0.123; TOST p = 0.32; smallest bound 0.39) or with non-bug issues held fixed (0.261, SE 0.095; TOST p = 0.55; smallest bound 0.42), as expected when the estimates are themselves positive. The bounds are anchored to the data, which is why the smallest bound for equivalence is reported as well.</w:t>
-      </w:r>
-    </w:p>
-    <w:p>
-      <w:pPr>
-        <w:pStyle w:val="BodyText"/>
-      </w:pPr>
-      <w:r>
-        <w:rPr>
-          <w:b/>
-          <w:bCs/>
-        </w:rPr>
-        <w:t xml:space="preserve">Heterogeneity. </w:t>
-      </w:r>
-      <w:r>
-        <w:t xml:space="preserve">Excluding the two repositories that may rely on automated release pipelines (anthropic-sdk-python and openai-python) leaves the conclusions unchanged. The pooled age slope is −0.003 under specification (b) (95% CI −0.015 to 0.010) and +0.019 under (d) (−0.007 to 0.044), and the coefficient on bug reports with non-bug issues held fixed rises to 0.304 (SE 0.093). </w:t>
-      </w:r>
-      <w:del w:id="9106" w:author="Claude" w:date="2026-10-13T00:00:00Z">
-        <w:r>
-          <w:delText xml:space="preserve">The thirteen slower releasers give 0.000 under (b) (−0.009 to 0.009), +0.015 under (d) (−0.006 to 0.034), and 0.211 (SE 0.082) for the response to bug reports. For the six weekly releasers (a median gap of at most one week between release weeks among all collected releases; Table 1 lists seven repositories with a median cycle of one week) the (b) estimate is imprecise (−0.033; −0.104 to 0.038), and the (d) estimate (0.248; 0.077 to 0.418) rests on few observations beyond the third week after a release and is not reliable.</w:delText>
-        </w:r>
-      </w:del>
-      <w:ins w:id="9107" w:author="Claude" w:date="2026-10-13T00:00:00Z">
-        <w:r>
-          <w:t xml:space="preserve">The twelve other repositories give 0.000 under (b) (−0.009 to 0.010), +0.014 under (d) (−0.005 to 0.033), and 0.158 (SE 0.097) for the response to bug reports. For the seven weekly releasers (Table 1) the estimates are imprecise: −0.021 (−0.072 to 0.031) under (b), +0.087 (−0.150 to 0.324) under (d), and 0.341 (SE 0.182) for the response to bug reports. The (d) estimate rests on few observations beyond the third week after a release and should be read with caution.</w:t>
-        </w:r>
-      </w:ins>
-      <w:r>
-        <w:t xml:space="preserve"> Within categories of three repositories the estimates are too imprecise to interpret; agent frameworks show a response to bug reports of 0.709 (SE 0.134) and inference engines an age slope under (d) of 0.045 (0.002 to 0.087), which we treat as exploratory.</w:t>
-      </w:r>
-    </w:p>
-    <w:p>
-      <w:pPr>
-        <w:pStyle w:val="Heading3"/>
-        <w:rPr>
-          <w:ins w:id="9131" w:author="Claude" w:date="2026-10-13T00:00:00Z"/>
-        </w:rPr>
-      </w:pPr>
-      <w:ins w:id="9132" w:author="Claude" w:date="2026-10-13T00:00:00Z">
-        <w:r>
-          <w:t xml:space="preserve">5.7. Receivers: Does Adoption Respond to Cadence?</w:t>
-        </w:r>
-      </w:ins>
-    </w:p>
-    <w:p>
-      <w:pPr>
-        <w:pStyle w:val="FirstParagraph"/>
-        <w:rPr>
-          <w:ins w:id="9133" w:author="Claude" w:date="2026-10-13T00:00:00Z"/>
-        </w:rPr>
-      </w:pPr>
-      <w:ins w:id="9134" w:author="Claude" w:date="2026-10-13T00:00:00Z">
-        <w:r>
-          <w:t xml:space="preserve">We find no detectable response of adoption to release cadence at the 5 percent level. One standard deviation more releases in the trailing eight weeks is followed by a change of −0.008 in log download growth (clustered SE 0.034; wild cluster bootstrap p = 0.94) and of 0.047 in log star growth (SE 0.025; p = 0.10). The additional response to releases that follow a bug surge is −0.026 (p = 0.50) for downloads and −0.022 (p = 0.24) for stars, and that to hot-fixes is 0.019 (p = 0.52) and −0.017 (p = 0.68). The estimates for stars are positive in all three models (0.047 to 0.064; p = 0.05 to 0.11), so a modest positive response of star growth cannot be excluded. Excluding the downloads of TensorRT-LLM, whose PyPI counts are incomplete, of autogen, whose PyPI packages are partly maintained by a fork, or of both leaves the download results unchanged (the response to releases is −0.005, −0.014, and −0.009; p = 0.91 or higher). With 16 clusters for downloads and 19 for stars, the minimum detectable effect at 80 percent power is about 0.09 and 0.07 log points per standard deviation, so the result does not show that receivers ignore cadence, only that adoption at weekly frequency does not reveal it. The argument of Section 2.4 then rests on the documented use of cadence in project-health assessments rather than on revealed behavior, and we say so in Section 6.3.</w:t>
-        </w:r>
-      </w:ins>
-    </w:p>
-    <w:p>
-      <w:pPr>
-        <w:pStyle w:val="Heading2"/>
-      </w:pPr>
-      <w:r>
-        <w:t xml:space="preserve">6. Discussion</w:t>
-      </w:r>
-    </w:p>
-    <w:p>
-      <w:pPr>
-        <w:pStyle w:val="Heading3"/>
-      </w:pPr>
-      <w:r>
-        <w:t xml:space="preserve">6.1. Interpretation</w:t>
-      </w:r>
-    </w:p>
-    <w:p>
-      <w:pPr>
-        <w:pStyle w:val="FirstParagraph"/>
-      </w:pPr>
-      <w:r>
-        <w:t xml:space="preserve">Releases in these repositories </w:t>
-      </w:r>
-      <w:del w:id="9151" w:author="Claude" w:date="2026-10-13T00:00:00Z">
-        <w:r>
-          <w:delText xml:space="preserve">respond to the volume of user activity and, more weakly, to accumulated work</w:delText>
-        </w:r>
-      </w:del>
-      <w:ins w:id="9152" w:author="Claude" w:date="2026-10-13T00:00:00Z">
-        <w:r>
-          <w:t xml:space="preserve">respond to the volume of user activity, to upstream model launches, and, more weakly, to accumulated work</w:t>
-        </w:r>
-      </w:ins>
-      <w:r>
-        <w:t xml:space="preserve">, but we find no clear relationship with an accumulating error state. Bug reports do not rise measurably with the age of a release relative to total issues, although a modest accumulation cannot be excluded once the post-release burst is absorbed. Release probabilities rise with the volume of user issues without a distinguishable extra response to bug reports, </w:t>
-      </w:r>
-      <w:del w:id="9153" w:author="Claude" w:date="2026-10-13T00:00:00Z">
-        <w:r>
-          <w:delText xml:space="preserve">releases show no detectable response to upstream model launches, and the release hazard tends to rise</w:delText>
-        </w:r>
-      </w:del>
-      <w:ins w:id="9154" w:author="Claude" w:date="2026-10-13T00:00:00Z">
-        <w:r>
-          <w:t xml:space="preserve">releases respond to upstream model launches within days, and the release hazard tends to rise</w:t>
-        </w:r>
-      </w:ins>
-      <w:r>
-        <w:t xml:space="preserve"> with the stock of merged changes. These findings suggest that the observable timing of maintenance need not form a feedback loop with system deterioration. This qualifies models that treat maintenance as a responsive, state-dependent control process: such models are valid only when an accumulating error state exists and maintainers respond to it, conditions that are not clearly met in these data. The evidence is consistent with release activity in this ecosystem </w:t>
-      </w:r>
-      <w:del w:id="9155" w:author="Claude" w:date="2026-10-13T00:00:00Z">
-        <w:r>
-          <w:delText xml:space="preserve">mainly reflecting user activity and the accumulation of development work</w:delText>
-        </w:r>
-      </w:del>
-      <w:ins w:id="9156" w:author="Claude" w:date="2026-10-13T00:00:00Z">
-        <w:r>
-          <w:t xml:space="preserve">mainly reflecting user activity, upstream launches, and the accumulation of development work</w:t>
-        </w:r>
-      </w:ins>
-      <w:r>
-        <w:t xml:space="preserve">. This distinction has implications for how information systems researchers conceptualize monitoring, feedback, and control in AI-enabled systems. In particular, treating release cadence as a validated signal of responsiveness </w:t>
-      </w:r>
-      <w:del w:id="9027" w:author="Claude" w:date="2026-10-13T00:00:00Z">
-        <w:r>
-          <w:delText xml:space="preserve">conflates development activity with a control response to degradation</w:delText>
-        </w:r>
-      </w:del>
-      <w:ins w:id="9028" w:author="Claude" w:date="2026-10-13T00:00:00Z">
-        <w:r>
-          <w:t xml:space="preserve">to degradation conflates responsiveness to users, to upstream launches, and to development work with a control response to deterioration</w:t>
-        </w:r>
-      </w:ins>
-      <w:r>
-        <w:t xml:space="preserve">. </w:t>
-      </w:r>
-    </w:p>
-    <w:p>
-      <w:pPr>
-        <w:pStyle w:val="FirstParagraph"/>
-      </w:pPr>
-      <w:r>
-        <w:t xml:space="preserve">The repositories therefore resemble firms whose adjustment responds to observable demand and to an accumulating stock of work, as in Sheshinski and Weiss (1977), but the state to which they respond is not clearly accumulated errors. A calendar cadence, as in Taylor (1980), cannot be excluded, because work and calendar time are correlated. Because bug reports build up at most modestly, these data cannot distinguish a maintainer who ignores an accumulating error state from one who has little to respond to. Both readings carry the same practical message. </w:t>
-      </w:r>
-    </w:p>
-    <w:p>
-      <w:pPr>
-        <w:pStyle w:val="FirstParagraph"/>
-      </w:pPr>
-      <w:r>
-        <w:t xml:space="preserve">In this ecosystem, we find no evidence that release timing is a mechanism through which degradation, if it occurs, would be corrected, </w:t>
-      </w:r>
-      <w:del w:id="9165" w:author="Claude" w:date="2026-10-13T00:00:00Z">
-        <w:r>
-          <w:delText xml:space="preserve">although releases do respond to the flow of user reports.</w:delText>
-        </w:r>
-      </w:del>
-      <w:ins w:id="9166" w:author="Claude" w:date="2026-10-13T00:00:00Z">
         <w:r>
           <w:t xml:space="preserve">although releases do respond to the flow of user reports and, within days, to upstream launches.</w:t>
         </w:r>
@@ -6561,12 +6568,12 @@
       <w:r>
         <w:t xml:space="preserve"> A project that releases every week looks actively maintained, but if release timing </w:t>
       </w:r>
-      <w:del w:id="9157" w:author="Claude" w:date="2026-10-13T00:00:00Z">
+      <w:del w:id="9159" w:author="Claude" w:date="2026-10-13T00:00:00Z">
         <w:r>
           <w:delText xml:space="preserve">follows user activity, accumulated work, or the calendar</w:delText>
         </w:r>
       </w:del>
-      <w:ins w:id="9158" w:author="Claude" w:date="2026-10-13T00:00:00Z">
+      <w:ins w:id="9160" w:author="Claude" w:date="2026-10-13T00:00:00Z">
         <w:r>
           <w:t xml:space="preserve">follows user activity, upstream launches, accumulated work, or the calendar</w:t>
         </w:r>
@@ -6589,12 +6596,12 @@
       <w:r>
         <w:t xml:space="preserve"> Recent AI regulation, such as the post-market monitoring provisions of the European Union’s AI Act, requires providers of high-risk systems to monitor performance after deployment. Our results suggest that, without explicit triggers tied to measured performance, </w:t>
       </w:r>
-      <w:del w:id="9159" w:author="Claude" w:date="2026-10-13T00:00:00Z">
+      <w:del w:id="9161" w:author="Claude" w:date="2026-10-13T00:00:00Z">
         <w:r>
           <w:delText xml:space="preserve">maintenance tends to follow user activity, accumulated work, or a calendar</w:delText>
         </w:r>
       </w:del>
-      <w:ins w:id="9160" w:author="Claude" w:date="2026-10-13T00:00:00Z">
+      <w:ins w:id="9162" w:author="Claude" w:date="2026-10-13T00:00:00Z">
         <w:r>
           <w:t xml:space="preserve">maintenance tends to follow user activity, upstream launches, accumulated work, or a calendar</w:t>
         </w:r>
@@ -6766,10 +6773,10 @@
       <w:pPr>
         <w:pStyle w:val="BodyText"/>
         <w:rPr>
-          <w:ins w:id="9177" w:author="Claude" w:date="2026-10-13T00:00:00Z"/>
-        </w:rPr>
-      </w:pPr>
-      <w:ins w:id="9178" w:author="Claude" w:date="2026-10-13T00:00:00Z">
+          <w:ins w:id="9179" w:author="Claude" w:date="2026-10-13T00:00:00Z"/>
+        </w:rPr>
+      </w:pPr>
+      <w:ins w:id="9180" w:author="Claude" w:date="2026-10-13T00:00:00Z">
         <w:r>
           <w:rPr>
             <w:b/>
@@ -6825,25 +6832,25 @@
       <w:r>
         <w:t xml:space="preserve">We asked whether release timing in the open-source LLM ecosystem follows a state-dependent rule, in which accumulating degradation triggers a refresh, or a time-dependent rule, in which it does not. In 19 repositories, bug reports do not rise measurably with the age of a release relative to total issues, although a modest accumulation cannot be excluded once the post-release burst is absorbed. Release probabilities rise with the volume of user issues without a distinguishable extra response to bug reports, </w:t>
       </w:r>
-      <w:del w:id="9161" w:author="Claude" w:date="2026-10-13T00:00:00Z">
+      <w:del w:id="9163" w:author="Claude" w:date="2026-10-13T00:00:00Z">
         <w:r>
           <w:delText xml:space="preserve">releases show no detectable response to upstream model launches, and the release hazard rises significantly</w:delText>
-        </w:r>
-      </w:del>
-      <w:ins w:id="9162" w:author="Claude" w:date="2026-10-13T00:00:00Z">
-        <w:r>
-          <w:t xml:space="preserve">releases respond to upstream model launches within days, and the release hazard rises significantly</w:t>
-        </w:r>
-      </w:ins>
-      <w:r>
-        <w:t xml:space="preserve"> with age in only one repository. The hazard does tend to rise with the stock of merged changes, although the data cannot cleanly separate that stock from calendar time. Release timing in this ecosystem therefore </w:t>
-      </w:r>
-      <w:del w:id="9163" w:author="Claude" w:date="2026-10-13T00:00:00Z">
-        <w:r>
-          <w:delText xml:space="preserve">appears to follow user activity and accumulating work</w:delText>
         </w:r>
       </w:del>
       <w:ins w:id="9164" w:author="Claude" w:date="2026-10-13T00:00:00Z">
+        <w:r>
+          <w:t xml:space="preserve">releases respond to upstream model launches within days, and the release hazard rises significantly</w:t>
+        </w:r>
+      </w:ins>
+      <w:r>
+        <w:t xml:space="preserve"> with age in only one repository. The hazard does tend to rise with the stock of merged changes, although the data cannot cleanly separate that stock from calendar time. Release timing in this ecosystem therefore </w:t>
+      </w:r>
+      <w:del w:id="9165" w:author="Claude" w:date="2026-10-13T00:00:00Z">
+        <w:r>
+          <w:delText xml:space="preserve">appears to follow user activity and accumulating work</w:delText>
+        </w:r>
+      </w:del>
+      <w:ins w:id="9166" w:author="Claude" w:date="2026-10-13T00:00:00Z">
         <w:r>
           <w:t xml:space="preserve">appears to follow user activity, upstream launches, and accumulating work</w:t>
         </w:r>

</xml_diff>

<commit_message>
Submission files: clean manuscript, title page, cover letter, contribution statement; fix paragraph property order in figure paragraphs
Co-Authored-By: Claude Sonnet 5.5 <noreply@anthropic.com>
Claude-Session: https://claude.ai/code/session_017rpe9Z3CoCCyiANf2szbvW
</commit_message>
<xml_diff>
--- a/isr-revision/manuscript/Manuscript_ISR_Format_tracked.docx
+++ b/isr-revision/manuscript/Manuscript_ISR_Format_tracked.docx
@@ -5713,8 +5713,8 @@
     </w:p>
     <w:p>
       <w:pPr>
+        <w:pStyle w:val="BodyText"/>
         <w:keepNext/>
-        <w:pStyle w:val="BodyText"/>
         <w:spacing w:before="120" w:after="60" w:line="240" w:lineRule="auto"/>
         <w:ind w:firstLine="0"/>
         <w:jc w:val="center"/>
@@ -5804,8 +5804,8 @@
     </w:p>
     <w:p>
       <w:pPr>
+        <w:pStyle w:val="BodyText"/>
         <w:keepNext/>
-        <w:pStyle w:val="BodyText"/>
         <w:spacing w:before="120" w:after="60" w:line="240" w:lineRule="auto"/>
         <w:ind w:firstLine="0"/>
         <w:jc w:val="center"/>
@@ -5994,8 +5994,8 @@
     </w:p>
     <w:p>
       <w:pPr>
+        <w:pStyle w:val="BodyText"/>
         <w:keepNext/>
-        <w:pStyle w:val="BodyText"/>
         <w:spacing w:before="120" w:after="60" w:line="240" w:lineRule="auto"/>
         <w:ind w:firstLine="0"/>
         <w:jc w:val="center"/>
@@ -6133,8 +6133,8 @@
     </w:p>
     <w:p>
       <w:pPr>
+        <w:pStyle w:val="BodyText"/>
         <w:keepNext/>
-        <w:pStyle w:val="BodyText"/>
         <w:spacing w:before="120" w:after="60" w:line="240" w:lineRule="auto"/>
         <w:ind w:firstLine="0"/>
         <w:jc w:val="center"/>

</xml_diff>